<commit_message>
Edited Report and PPT
</commit_message>
<xml_diff>
--- a/docs/Clg 1st Report.docx
+++ b/docs/Clg 1st Report.docx
@@ -143,16 +143,8 @@
               <w:rPr>
                 <w:rFonts w:ascii="Times New Roman" w:hAnsi="Times New Roman" w:cs="Times New Roman"/>
               </w:rPr>
-              <w:t xml:space="preserve">Guided </w:t>
+              <w:t>Guided By:-</w:t>
             </w:r>
-            <w:proofErr w:type="gramStart"/>
-            <w:r>
-              <w:rPr>
-                <w:rFonts w:ascii="Times New Roman" w:hAnsi="Times New Roman" w:cs="Times New Roman"/>
-              </w:rPr>
-              <w:t>By:-</w:t>
-            </w:r>
-            <w:proofErr w:type="gramEnd"/>
           </w:p>
         </w:tc>
       </w:tr>
@@ -204,25 +196,7 @@
                 <w:sz w:val="24"/>
                 <w:szCs w:val="24"/>
               </w:rPr>
-              <w:t xml:space="preserve">Prof. Umesh </w:t>
-            </w:r>
-            <w:proofErr w:type="spellStart"/>
-            <w:r>
-              <w:rPr>
-                <w:bCs/>
-                <w:sz w:val="24"/>
-                <w:szCs w:val="24"/>
-              </w:rPr>
-              <w:t>Lakhtariya</w:t>
-            </w:r>
-            <w:proofErr w:type="spellEnd"/>
-            <w:r>
-              <w:rPr>
-                <w:bCs/>
-                <w:sz w:val="24"/>
-                <w:szCs w:val="24"/>
-              </w:rPr>
-              <w:t xml:space="preserve"> (Internal)</w:t>
+              <w:t>Prof. Umesh Lakhtariya (Internal)</w:t>
             </w:r>
           </w:p>
         </w:tc>
@@ -842,7 +816,7 @@
                 <w:sz w:val="28"/>
                 <w:szCs w:val="28"/>
               </w:rPr>
-              <w:t>4</w:t>
+              <w:t>1</w:t>
             </w:r>
           </w:p>
         </w:tc>
@@ -917,6 +891,373 @@
                 <w:sz w:val="28"/>
                 <w:szCs w:val="28"/>
               </w:rPr>
+              <w:t>2</w:t>
+            </w:r>
+          </w:p>
+        </w:tc>
+      </w:tr>
+      <w:tr>
+        <w:tc>
+          <w:tcPr>
+            <w:tcW w:w="7735" w:type="dxa"/>
+          </w:tcPr>
+          <w:p>
+            <w:pPr>
+              <w:rPr>
+                <w:sz w:val="28"/>
+                <w:szCs w:val="28"/>
+              </w:rPr>
+            </w:pPr>
+          </w:p>
+        </w:tc>
+        <w:tc>
+          <w:tcPr>
+            <w:tcW w:w="1615" w:type="dxa"/>
+          </w:tcPr>
+          <w:p>
+            <w:pPr>
+              <w:jc w:val="right"/>
+              <w:rPr>
+                <w:sz w:val="28"/>
+                <w:szCs w:val="28"/>
+              </w:rPr>
+            </w:pPr>
+          </w:p>
+        </w:tc>
+      </w:tr>
+      <w:tr>
+        <w:tc>
+          <w:tcPr>
+            <w:tcW w:w="7735" w:type="dxa"/>
+          </w:tcPr>
+          <w:p>
+            <w:pPr>
+              <w:rPr>
+                <w:sz w:val="28"/>
+                <w:szCs w:val="28"/>
+              </w:rPr>
+            </w:pPr>
+            <w:r>
+              <w:rPr>
+                <w:sz w:val="28"/>
+                <w:szCs w:val="28"/>
+              </w:rPr>
+              <w:t>CHAPTER 3: SOFTWARE AND HARDWARE REQUIREMENTS</w:t>
+            </w:r>
+          </w:p>
+        </w:tc>
+        <w:tc>
+          <w:tcPr>
+            <w:tcW w:w="1615" w:type="dxa"/>
+          </w:tcPr>
+          <w:p>
+            <w:pPr>
+              <w:jc w:val="right"/>
+              <w:rPr>
+                <w:sz w:val="28"/>
+                <w:szCs w:val="28"/>
+              </w:rPr>
+            </w:pPr>
+            <w:r>
+              <w:rPr>
+                <w:sz w:val="28"/>
+                <w:szCs w:val="28"/>
+              </w:rPr>
+              <w:t>3</w:t>
+            </w:r>
+          </w:p>
+        </w:tc>
+      </w:tr>
+      <w:tr>
+        <w:tc>
+          <w:tcPr>
+            <w:tcW w:w="7735" w:type="dxa"/>
+          </w:tcPr>
+          <w:p>
+            <w:pPr>
+              <w:rPr>
+                <w:sz w:val="28"/>
+                <w:szCs w:val="28"/>
+              </w:rPr>
+            </w:pPr>
+            <w:r>
+              <w:rPr>
+                <w:sz w:val="28"/>
+                <w:szCs w:val="28"/>
+              </w:rPr>
+              <w:t xml:space="preserve">              </w:t>
+            </w:r>
+            <w:r>
+              <w:rPr>
+                <w:sz w:val="28"/>
+                <w:szCs w:val="28"/>
+              </w:rPr>
+              <w:t xml:space="preserve">3.1 </w:t>
+            </w:r>
+            <w:r>
+              <w:rPr>
+                <w:sz w:val="32"/>
+                <w:szCs w:val="32"/>
+              </w:rPr>
+              <w:t>Minimum Software Requirements</w:t>
+            </w:r>
+          </w:p>
+        </w:tc>
+        <w:tc>
+          <w:tcPr>
+            <w:tcW w:w="1615" w:type="dxa"/>
+          </w:tcPr>
+          <w:p>
+            <w:pPr>
+              <w:jc w:val="right"/>
+              <w:rPr>
+                <w:sz w:val="28"/>
+                <w:szCs w:val="28"/>
+              </w:rPr>
+            </w:pPr>
+            <w:r>
+              <w:rPr>
+                <w:sz w:val="28"/>
+                <w:szCs w:val="28"/>
+              </w:rPr>
+              <w:t>3</w:t>
+            </w:r>
+          </w:p>
+        </w:tc>
+      </w:tr>
+      <w:tr>
+        <w:tc>
+          <w:tcPr>
+            <w:tcW w:w="7735" w:type="dxa"/>
+          </w:tcPr>
+          <w:p>
+            <w:pPr>
+              <w:rPr>
+                <w:sz w:val="28"/>
+                <w:szCs w:val="28"/>
+              </w:rPr>
+            </w:pPr>
+            <w:r>
+              <w:rPr>
+                <w:sz w:val="28"/>
+                <w:szCs w:val="28"/>
+              </w:rPr>
+              <w:t xml:space="preserve">              </w:t>
+            </w:r>
+            <w:r>
+              <w:rPr>
+                <w:sz w:val="28"/>
+                <w:szCs w:val="28"/>
+              </w:rPr>
+              <w:t xml:space="preserve">3.2 </w:t>
+            </w:r>
+            <w:r>
+              <w:rPr>
+                <w:sz w:val="32"/>
+                <w:szCs w:val="32"/>
+              </w:rPr>
+              <w:t>Minimum Hardware Requirements</w:t>
+            </w:r>
+          </w:p>
+        </w:tc>
+        <w:tc>
+          <w:tcPr>
+            <w:tcW w:w="1615" w:type="dxa"/>
+          </w:tcPr>
+          <w:p>
+            <w:pPr>
+              <w:jc w:val="right"/>
+              <w:rPr>
+                <w:sz w:val="28"/>
+                <w:szCs w:val="28"/>
+              </w:rPr>
+            </w:pPr>
+            <w:r>
+              <w:rPr>
+                <w:sz w:val="28"/>
+                <w:szCs w:val="28"/>
+              </w:rPr>
+              <w:t>3</w:t>
+            </w:r>
+          </w:p>
+        </w:tc>
+      </w:tr>
+      <w:tr>
+        <w:tc>
+          <w:tcPr>
+            <w:tcW w:w="7735" w:type="dxa"/>
+          </w:tcPr>
+          <w:p>
+            <w:pPr>
+              <w:rPr>
+                <w:sz w:val="28"/>
+                <w:szCs w:val="28"/>
+              </w:rPr>
+            </w:pPr>
+          </w:p>
+        </w:tc>
+        <w:tc>
+          <w:tcPr>
+            <w:tcW w:w="1615" w:type="dxa"/>
+          </w:tcPr>
+          <w:p>
+            <w:pPr>
+              <w:jc w:val="right"/>
+              <w:rPr>
+                <w:sz w:val="28"/>
+                <w:szCs w:val="28"/>
+              </w:rPr>
+            </w:pPr>
+          </w:p>
+        </w:tc>
+      </w:tr>
+      <w:tr>
+        <w:tc>
+          <w:tcPr>
+            <w:tcW w:w="7735" w:type="dxa"/>
+          </w:tcPr>
+          <w:p>
+            <w:pPr>
+              <w:rPr>
+                <w:sz w:val="28"/>
+                <w:szCs w:val="28"/>
+              </w:rPr>
+            </w:pPr>
+            <w:r>
+              <w:rPr>
+                <w:sz w:val="28"/>
+                <w:szCs w:val="28"/>
+              </w:rPr>
+              <w:t>CHAPTER 4: PROCESS MODEL</w:t>
+            </w:r>
+          </w:p>
+        </w:tc>
+        <w:tc>
+          <w:tcPr>
+            <w:tcW w:w="1615" w:type="dxa"/>
+          </w:tcPr>
+          <w:p>
+            <w:pPr>
+              <w:jc w:val="right"/>
+              <w:rPr>
+                <w:sz w:val="28"/>
+                <w:szCs w:val="28"/>
+              </w:rPr>
+            </w:pPr>
+            <w:r>
+              <w:rPr>
+                <w:sz w:val="28"/>
+                <w:szCs w:val="28"/>
+              </w:rPr>
+              <w:t>4</w:t>
+            </w:r>
+          </w:p>
+        </w:tc>
+      </w:tr>
+      <w:tr>
+        <w:tc>
+          <w:tcPr>
+            <w:tcW w:w="7735" w:type="dxa"/>
+          </w:tcPr>
+          <w:p>
+            <w:pPr>
+              <w:rPr>
+                <w:sz w:val="28"/>
+                <w:szCs w:val="28"/>
+              </w:rPr>
+            </w:pPr>
+            <w:r>
+              <w:rPr>
+                <w:sz w:val="28"/>
+                <w:szCs w:val="28"/>
+              </w:rPr>
+              <w:t xml:space="preserve">              4.1 </w:t>
+            </w:r>
+            <w:r>
+              <w:rPr>
+                <w:sz w:val="28"/>
+                <w:szCs w:val="28"/>
+              </w:rPr>
+              <w:t>Model Overview</w:t>
+            </w:r>
+            <w:r>
+              <w:rPr>
+                <w:sz w:val="28"/>
+                <w:szCs w:val="28"/>
+              </w:rPr>
+              <w:t xml:space="preserve">     </w:t>
+            </w:r>
+          </w:p>
+        </w:tc>
+        <w:tc>
+          <w:tcPr>
+            <w:tcW w:w="1615" w:type="dxa"/>
+          </w:tcPr>
+          <w:p>
+            <w:pPr>
+              <w:jc w:val="right"/>
+              <w:rPr>
+                <w:sz w:val="28"/>
+                <w:szCs w:val="28"/>
+              </w:rPr>
+            </w:pPr>
+            <w:r>
+              <w:rPr>
+                <w:sz w:val="28"/>
+                <w:szCs w:val="28"/>
+              </w:rPr>
+              <w:t>4</w:t>
+            </w:r>
+          </w:p>
+        </w:tc>
+      </w:tr>
+      <w:tr>
+        <w:tc>
+          <w:tcPr>
+            <w:tcW w:w="7735" w:type="dxa"/>
+          </w:tcPr>
+          <w:p>
+            <w:pPr>
+              <w:rPr>
+                <w:b/>
+                <w:bCs/>
+                <w:sz w:val="28"/>
+                <w:szCs w:val="28"/>
+              </w:rPr>
+            </w:pPr>
+            <w:r>
+              <w:rPr>
+                <w:sz w:val="28"/>
+                <w:szCs w:val="28"/>
+              </w:rPr>
+              <w:t xml:space="preserve">              4.2 </w:t>
+            </w:r>
+            <w:r>
+              <w:rPr>
+                <w:sz w:val="28"/>
+                <w:szCs w:val="28"/>
+              </w:rPr>
+              <w:t>Data Preparation</w:t>
+            </w:r>
+          </w:p>
+        </w:tc>
+        <w:tc>
+          <w:tcPr>
+            <w:tcW w:w="1615" w:type="dxa"/>
+          </w:tcPr>
+          <w:p>
+            <w:pPr>
+              <w:jc w:val="right"/>
+              <w:rPr>
+                <w:sz w:val="28"/>
+                <w:szCs w:val="28"/>
+              </w:rPr>
+            </w:pPr>
+            <w:r>
+              <w:rPr>
+                <w:sz w:val="28"/>
+                <w:szCs w:val="28"/>
+              </w:rPr>
               <w:t>5</w:t>
             </w:r>
           </w:p>
@@ -934,227 +1275,26 @@
                 <w:szCs w:val="28"/>
               </w:rPr>
             </w:pPr>
-          </w:p>
-        </w:tc>
-        <w:tc>
-          <w:tcPr>
-            <w:tcW w:w="1615" w:type="dxa"/>
-          </w:tcPr>
-          <w:p>
-            <w:pPr>
-              <w:jc w:val="right"/>
-              <w:rPr>
-                <w:sz w:val="28"/>
-                <w:szCs w:val="28"/>
-              </w:rPr>
-            </w:pPr>
-          </w:p>
-        </w:tc>
-      </w:tr>
-      <w:tr>
-        <w:tc>
-          <w:tcPr>
-            <w:tcW w:w="7735" w:type="dxa"/>
-          </w:tcPr>
-          <w:p>
-            <w:pPr>
-              <w:rPr>
-                <w:sz w:val="28"/>
-                <w:szCs w:val="28"/>
-              </w:rPr>
-            </w:pPr>
             <w:r>
               <w:rPr>
                 <w:sz w:val="28"/>
                 <w:szCs w:val="28"/>
               </w:rPr>
-              <w:t>CHAPTER 3: SOFTWARE AND HARDWARE REQUIREMENTS</w:t>
-            </w:r>
-          </w:p>
-        </w:tc>
-        <w:tc>
-          <w:tcPr>
-            <w:tcW w:w="1615" w:type="dxa"/>
-          </w:tcPr>
-          <w:p>
-            <w:pPr>
-              <w:jc w:val="right"/>
-              <w:rPr>
-                <w:sz w:val="28"/>
-                <w:szCs w:val="28"/>
-              </w:rPr>
-            </w:pPr>
-            <w:r>
-              <w:rPr>
-                <w:sz w:val="28"/>
-                <w:szCs w:val="28"/>
-              </w:rPr>
-              <w:t>6</w:t>
-            </w:r>
-          </w:p>
-        </w:tc>
-      </w:tr>
-      <w:tr>
-        <w:tc>
-          <w:tcPr>
-            <w:tcW w:w="7735" w:type="dxa"/>
-          </w:tcPr>
-          <w:p>
-            <w:pPr>
-              <w:rPr>
-                <w:sz w:val="28"/>
-                <w:szCs w:val="28"/>
-              </w:rPr>
-            </w:pPr>
-            <w:r>
-              <w:rPr>
-                <w:sz w:val="28"/>
-                <w:szCs w:val="28"/>
-              </w:rPr>
-              <w:t xml:space="preserve">              </w:t>
+              <w:t xml:space="preserve">              4.3 </w:t>
             </w:r>
             <w:r>
               <w:rPr>
                 <w:sz w:val="28"/>
                 <w:szCs w:val="28"/>
               </w:rPr>
-              <w:t xml:space="preserve">3.1 </w:t>
+              <w:t>LSTM Model Architecture</w:t>
             </w:r>
             <w:r>
               <w:rPr>
-                <w:sz w:val="32"/>
-                <w:szCs w:val="32"/>
-              </w:rPr>
-              <w:t>Minimum Software Requirements</w:t>
-            </w:r>
-          </w:p>
-        </w:tc>
-        <w:tc>
-          <w:tcPr>
-            <w:tcW w:w="1615" w:type="dxa"/>
-          </w:tcPr>
-          <w:p>
-            <w:pPr>
-              <w:jc w:val="right"/>
-              <w:rPr>
-                <w:sz w:val="28"/>
-                <w:szCs w:val="28"/>
-              </w:rPr>
-            </w:pPr>
-            <w:r>
-              <w:rPr>
-                <w:sz w:val="28"/>
-                <w:szCs w:val="28"/>
-              </w:rPr>
-              <w:t>6</w:t>
-            </w:r>
-          </w:p>
-        </w:tc>
-      </w:tr>
-      <w:tr>
-        <w:tc>
-          <w:tcPr>
-            <w:tcW w:w="7735" w:type="dxa"/>
-          </w:tcPr>
-          <w:p>
-            <w:pPr>
-              <w:rPr>
-                <w:sz w:val="28"/>
-                <w:szCs w:val="28"/>
-              </w:rPr>
-            </w:pPr>
-            <w:r>
-              <w:rPr>
-                <w:sz w:val="28"/>
-                <w:szCs w:val="28"/>
-              </w:rPr>
-              <w:t xml:space="preserve">              </w:t>
-            </w:r>
-            <w:r>
-              <w:rPr>
-                <w:sz w:val="28"/>
-                <w:szCs w:val="28"/>
-              </w:rPr>
-              <w:t xml:space="preserve">3.2 </w:t>
-            </w:r>
-            <w:r>
-              <w:rPr>
-                <w:sz w:val="32"/>
-                <w:szCs w:val="32"/>
-              </w:rPr>
-              <w:t>Minimum Hardware Requirements</w:t>
-            </w:r>
-          </w:p>
-        </w:tc>
-        <w:tc>
-          <w:tcPr>
-            <w:tcW w:w="1615" w:type="dxa"/>
-          </w:tcPr>
-          <w:p>
-            <w:pPr>
-              <w:jc w:val="right"/>
-              <w:rPr>
-                <w:sz w:val="28"/>
-                <w:szCs w:val="28"/>
-              </w:rPr>
-            </w:pPr>
-            <w:r>
-              <w:rPr>
-                <w:sz w:val="28"/>
-                <w:szCs w:val="28"/>
-              </w:rPr>
-              <w:t>6</w:t>
-            </w:r>
-          </w:p>
-        </w:tc>
-      </w:tr>
-      <w:tr>
-        <w:tc>
-          <w:tcPr>
-            <w:tcW w:w="7735" w:type="dxa"/>
-          </w:tcPr>
-          <w:p>
-            <w:pPr>
-              <w:rPr>
-                <w:sz w:val="28"/>
-                <w:szCs w:val="28"/>
-              </w:rPr>
-            </w:pPr>
-          </w:p>
-        </w:tc>
-        <w:tc>
-          <w:tcPr>
-            <w:tcW w:w="1615" w:type="dxa"/>
-          </w:tcPr>
-          <w:p>
-            <w:pPr>
-              <w:jc w:val="right"/>
-              <w:rPr>
-                <w:sz w:val="28"/>
-                <w:szCs w:val="28"/>
-              </w:rPr>
-            </w:pPr>
-          </w:p>
-        </w:tc>
-      </w:tr>
-      <w:tr>
-        <w:tc>
-          <w:tcPr>
-            <w:tcW w:w="7735" w:type="dxa"/>
-          </w:tcPr>
-          <w:p>
-            <w:pPr>
-              <w:rPr>
-                <w:sz w:val="28"/>
-                <w:szCs w:val="28"/>
-              </w:rPr>
-            </w:pPr>
-            <w:r>
-              <w:rPr>
-                <w:sz w:val="28"/>
-                <w:szCs w:val="28"/>
-              </w:rPr>
-              <w:t>CHAPTER 4: PROCESS MODEL</w:t>
+                <w:sz w:val="28"/>
+                <w:szCs w:val="28"/>
+              </w:rPr>
+              <w:t xml:space="preserve"> </w:t>
             </w:r>
           </w:p>
         </w:tc>
@@ -1197,21 +1337,14 @@
                 <w:sz w:val="28"/>
                 <w:szCs w:val="28"/>
               </w:rPr>
-              <w:t xml:space="preserve">              4.1 </w:t>
+              <w:t xml:space="preserve">              4.4 </w:t>
             </w:r>
             <w:r>
               <w:rPr>
                 <w:sz w:val="28"/>
                 <w:szCs w:val="28"/>
               </w:rPr>
-              <w:t>Model Overview</w:t>
-            </w:r>
-            <w:r>
-              <w:rPr>
-                <w:sz w:val="28"/>
-                <w:szCs w:val="28"/>
-              </w:rPr>
-              <w:t xml:space="preserve">     </w:t>
+              <w:t>Model Training</w:t>
             </w:r>
           </w:p>
         </w:tc>
@@ -1245,8 +1378,6 @@
           <w:p>
             <w:pPr>
               <w:rPr>
-                <w:b/>
-                <w:bCs/>
                 <w:sz w:val="28"/>
                 <w:szCs w:val="28"/>
               </w:rPr>
@@ -1256,14 +1387,14 @@
                 <w:sz w:val="28"/>
                 <w:szCs w:val="28"/>
               </w:rPr>
-              <w:t xml:space="preserve">              4.2 </w:t>
+              <w:t xml:space="preserve">              4.5 </w:t>
             </w:r>
             <w:r>
               <w:rPr>
                 <w:sz w:val="28"/>
                 <w:szCs w:val="28"/>
               </w:rPr>
-              <w:t>Data Preparation</w:t>
+              <w:t>Model Evaluation</w:t>
             </w:r>
           </w:p>
         </w:tc>
@@ -1306,21 +1437,64 @@
                 <w:sz w:val="28"/>
                 <w:szCs w:val="28"/>
               </w:rPr>
-              <w:t xml:space="preserve">              4.3 </w:t>
+              <w:t xml:space="preserve">              4.6 P</w:t>
             </w:r>
             <w:r>
               <w:rPr>
                 <w:sz w:val="28"/>
                 <w:szCs w:val="28"/>
               </w:rPr>
-              <w:t>LSTM Model Architecture</w:t>
+              <w:t>rediction Process</w:t>
+            </w:r>
+          </w:p>
+        </w:tc>
+        <w:tc>
+          <w:tcPr>
+            <w:tcW w:w="1615" w:type="dxa"/>
+          </w:tcPr>
+          <w:p>
+            <w:pPr>
+              <w:jc w:val="right"/>
+              <w:rPr>
+                <w:sz w:val="28"/>
+                <w:szCs w:val="28"/>
+              </w:rPr>
+            </w:pPr>
+            <w:r>
+              <w:rPr>
+                <w:sz w:val="28"/>
+                <w:szCs w:val="28"/>
+              </w:rPr>
+              <w:t>9</w:t>
+            </w:r>
+          </w:p>
+        </w:tc>
+      </w:tr>
+      <w:tr>
+        <w:tc>
+          <w:tcPr>
+            <w:tcW w:w="7735" w:type="dxa"/>
+          </w:tcPr>
+          <w:p>
+            <w:pPr>
+              <w:rPr>
+                <w:sz w:val="28"/>
+                <w:szCs w:val="28"/>
+              </w:rPr>
+            </w:pPr>
+            <w:r>
+              <w:rPr>
+                <w:sz w:val="28"/>
+                <w:szCs w:val="28"/>
+              </w:rPr>
+              <w:t xml:space="preserve">              4.7 M</w:t>
             </w:r>
             <w:r>
               <w:rPr>
                 <w:sz w:val="28"/>
                 <w:szCs w:val="28"/>
               </w:rPr>
-              <w:t xml:space="preserve"> </w:t>
+              <w:t>odel Deployment</w:t>
             </w:r>
           </w:p>
         </w:tc>
@@ -1363,14 +1537,14 @@
                 <w:sz w:val="28"/>
                 <w:szCs w:val="28"/>
               </w:rPr>
-              <w:t xml:space="preserve">              4.4 </w:t>
+              <w:t xml:space="preserve">              4.8 M</w:t>
             </w:r>
             <w:r>
               <w:rPr>
                 <w:sz w:val="28"/>
                 <w:szCs w:val="28"/>
               </w:rPr>
-              <w:t>Model Training</w:t>
+              <w:t>odel Maintainence</w:t>
             </w:r>
           </w:p>
         </w:tc>
@@ -1391,7 +1565,14 @@
                 <w:sz w:val="28"/>
                 <w:szCs w:val="28"/>
               </w:rPr>
-              <w:t>10</w:t>
+              <w:t>1</w:t>
+            </w:r>
+            <w:r>
+              <w:rPr>
+                <w:sz w:val="28"/>
+                <w:szCs w:val="28"/>
+              </w:rPr>
+              <w:t>0</w:t>
             </w:r>
           </w:p>
         </w:tc>
@@ -1413,14 +1594,14 @@
                 <w:sz w:val="28"/>
                 <w:szCs w:val="28"/>
               </w:rPr>
-              <w:t xml:space="preserve">              4.5 </w:t>
+              <w:t xml:space="preserve">              4.9 L</w:t>
             </w:r>
             <w:r>
               <w:rPr>
                 <w:sz w:val="28"/>
                 <w:szCs w:val="28"/>
               </w:rPr>
-              <w:t>Model Evaluation</w:t>
+              <w:t>imitations &amp; Assumptions</w:t>
             </w:r>
           </w:p>
         </w:tc>
@@ -1441,7 +1622,14 @@
                 <w:sz w:val="28"/>
                 <w:szCs w:val="28"/>
               </w:rPr>
-              <w:t>11</w:t>
+              <w:t>1</w:t>
+            </w:r>
+            <w:r>
+              <w:rPr>
+                <w:sz w:val="28"/>
+                <w:szCs w:val="28"/>
+              </w:rPr>
+              <w:t>1</w:t>
             </w:r>
           </w:p>
         </w:tc>
@@ -1463,14 +1651,14 @@
                 <w:sz w:val="28"/>
                 <w:szCs w:val="28"/>
               </w:rPr>
-              <w:t xml:space="preserve">              4.6 P</w:t>
+              <w:t xml:space="preserve">              4.10 E</w:t>
             </w:r>
             <w:r>
               <w:rPr>
                 <w:sz w:val="28"/>
                 <w:szCs w:val="28"/>
               </w:rPr>
-              <w:t>rediction Process</w:t>
+              <w:t>xpected Outcomes</w:t>
             </w:r>
           </w:p>
         </w:tc>
@@ -1491,7 +1679,14 @@
                 <w:sz w:val="28"/>
                 <w:szCs w:val="28"/>
               </w:rPr>
-              <w:t>12</w:t>
+              <w:t>1</w:t>
+            </w:r>
+            <w:r>
+              <w:rPr>
+                <w:sz w:val="28"/>
+                <w:szCs w:val="28"/>
+              </w:rPr>
+              <w:t>1</w:t>
             </w:r>
           </w:p>
         </w:tc>
@@ -1508,19 +1703,41 @@
                 <w:szCs w:val="28"/>
               </w:rPr>
             </w:pPr>
+          </w:p>
+        </w:tc>
+        <w:tc>
+          <w:tcPr>
+            <w:tcW w:w="1615" w:type="dxa"/>
+          </w:tcPr>
+          <w:p>
+            <w:pPr>
+              <w:jc w:val="right"/>
+              <w:rPr>
+                <w:sz w:val="28"/>
+                <w:szCs w:val="28"/>
+              </w:rPr>
+            </w:pPr>
+          </w:p>
+        </w:tc>
+      </w:tr>
+      <w:tr>
+        <w:tc>
+          <w:tcPr>
+            <w:tcW w:w="7735" w:type="dxa"/>
+          </w:tcPr>
+          <w:p>
+            <w:pPr>
+              <w:rPr>
+                <w:sz w:val="28"/>
+                <w:szCs w:val="28"/>
+              </w:rPr>
+            </w:pPr>
             <w:r>
               <w:rPr>
                 <w:sz w:val="28"/>
                 <w:szCs w:val="28"/>
               </w:rPr>
-              <w:t xml:space="preserve">              4.7 M</w:t>
-            </w:r>
-            <w:r>
-              <w:rPr>
-                <w:sz w:val="28"/>
-                <w:szCs w:val="28"/>
-              </w:rPr>
-              <w:t>odel Deployment</w:t>
+              <w:t>CHAPTER 5: PROJECT PLAN</w:t>
             </w:r>
           </w:p>
         </w:tc>
@@ -1541,7 +1758,14 @@
                 <w:sz w:val="28"/>
                 <w:szCs w:val="28"/>
               </w:rPr>
-              <w:t>13</w:t>
+              <w:t>1</w:t>
+            </w:r>
+            <w:r>
+              <w:rPr>
+                <w:sz w:val="28"/>
+                <w:szCs w:val="28"/>
+              </w:rPr>
+              <w:t>2</w:t>
             </w:r>
           </w:p>
         </w:tc>
@@ -1563,24 +1787,8 @@
                 <w:sz w:val="28"/>
                 <w:szCs w:val="28"/>
               </w:rPr>
-              <w:t xml:space="preserve">              4.8 M</w:t>
+              <w:t xml:space="preserve">              5.1 List Of Major Activities </w:t>
             </w:r>
-            <w:r>
-              <w:rPr>
-                <w:sz w:val="28"/>
-                <w:szCs w:val="28"/>
-              </w:rPr>
-              <w:t xml:space="preserve">odel </w:t>
-            </w:r>
-            <w:proofErr w:type="spellStart"/>
-            <w:r>
-              <w:rPr>
-                <w:sz w:val="28"/>
-                <w:szCs w:val="28"/>
-              </w:rPr>
-              <w:t>Maintainence</w:t>
-            </w:r>
-            <w:proofErr w:type="spellEnd"/>
           </w:p>
         </w:tc>
         <w:tc>
@@ -1600,7 +1808,14 @@
                 <w:sz w:val="28"/>
                 <w:szCs w:val="28"/>
               </w:rPr>
-              <w:t>13</w:t>
+              <w:t>1</w:t>
+            </w:r>
+            <w:r>
+              <w:rPr>
+                <w:sz w:val="28"/>
+                <w:szCs w:val="28"/>
+              </w:rPr>
+              <w:t>2</w:t>
             </w:r>
           </w:p>
         </w:tc>
@@ -1622,14 +1837,7 @@
                 <w:sz w:val="28"/>
                 <w:szCs w:val="28"/>
               </w:rPr>
-              <w:t xml:space="preserve">              4.9 L</w:t>
-            </w:r>
-            <w:r>
-              <w:rPr>
-                <w:sz w:val="28"/>
-                <w:szCs w:val="28"/>
-              </w:rPr>
-              <w:t>imitations &amp; Assumptions</w:t>
+              <w:t xml:space="preserve">              5.2 Estimated Time Durations</w:t>
             </w:r>
           </w:p>
         </w:tc>
@@ -1650,7 +1858,14 @@
                 <w:sz w:val="28"/>
                 <w:szCs w:val="28"/>
               </w:rPr>
-              <w:t>14</w:t>
+              <w:t>1</w:t>
+            </w:r>
+            <w:r>
+              <w:rPr>
+                <w:sz w:val="28"/>
+                <w:szCs w:val="28"/>
+              </w:rPr>
+              <w:t>4</w:t>
             </w:r>
           </w:p>
         </w:tc>
@@ -1667,19 +1882,41 @@
                 <w:szCs w:val="28"/>
               </w:rPr>
             </w:pPr>
+          </w:p>
+        </w:tc>
+        <w:tc>
+          <w:tcPr>
+            <w:tcW w:w="1615" w:type="dxa"/>
+          </w:tcPr>
+          <w:p>
+            <w:pPr>
+              <w:jc w:val="right"/>
+              <w:rPr>
+                <w:sz w:val="28"/>
+                <w:szCs w:val="28"/>
+              </w:rPr>
+            </w:pPr>
+          </w:p>
+        </w:tc>
+      </w:tr>
+      <w:tr>
+        <w:tc>
+          <w:tcPr>
+            <w:tcW w:w="7735" w:type="dxa"/>
+          </w:tcPr>
+          <w:p>
+            <w:pPr>
+              <w:rPr>
+                <w:sz w:val="28"/>
+                <w:szCs w:val="28"/>
+              </w:rPr>
+            </w:pPr>
             <w:r>
               <w:rPr>
                 <w:sz w:val="28"/>
                 <w:szCs w:val="28"/>
               </w:rPr>
-              <w:t xml:space="preserve">              4.10 E</w:t>
-            </w:r>
-            <w:r>
-              <w:rPr>
-                <w:sz w:val="28"/>
-                <w:szCs w:val="28"/>
-              </w:rPr>
-              <w:t>xpected Outcomes</w:t>
+              <w:t>CHAPTER 6: IMPLEMENTATION DETAILS</w:t>
             </w:r>
           </w:p>
         </w:tc>
@@ -1700,7 +1937,14 @@
                 <w:sz w:val="28"/>
                 <w:szCs w:val="28"/>
               </w:rPr>
-              <w:t>14</w:t>
+              <w:t>1</w:t>
+            </w:r>
+            <w:r>
+              <w:rPr>
+                <w:sz w:val="28"/>
+                <w:szCs w:val="28"/>
+              </w:rPr>
+              <w:t>5</w:t>
             </w:r>
           </w:p>
         </w:tc>
@@ -1717,6 +1961,600 @@
                 <w:szCs w:val="28"/>
               </w:rPr>
             </w:pPr>
+            <w:r>
+              <w:rPr>
+                <w:sz w:val="28"/>
+                <w:szCs w:val="28"/>
+              </w:rPr>
+              <w:t xml:space="preserve">              6.1 Project Execution Workflow</w:t>
+            </w:r>
+          </w:p>
+        </w:tc>
+        <w:tc>
+          <w:tcPr>
+            <w:tcW w:w="1615" w:type="dxa"/>
+          </w:tcPr>
+          <w:p>
+            <w:pPr>
+              <w:jc w:val="right"/>
+              <w:rPr>
+                <w:sz w:val="28"/>
+                <w:szCs w:val="28"/>
+              </w:rPr>
+            </w:pPr>
+            <w:r>
+              <w:rPr>
+                <w:sz w:val="28"/>
+                <w:szCs w:val="28"/>
+              </w:rPr>
+              <w:t>1</w:t>
+            </w:r>
+            <w:r>
+              <w:rPr>
+                <w:sz w:val="28"/>
+                <w:szCs w:val="28"/>
+              </w:rPr>
+              <w:t>5</w:t>
+            </w:r>
+          </w:p>
+        </w:tc>
+      </w:tr>
+      <w:tr>
+        <w:tc>
+          <w:tcPr>
+            <w:tcW w:w="7735" w:type="dxa"/>
+          </w:tcPr>
+          <w:p>
+            <w:pPr>
+              <w:rPr>
+                <w:sz w:val="28"/>
+                <w:szCs w:val="28"/>
+              </w:rPr>
+            </w:pPr>
+            <w:r>
+              <w:rPr>
+                <w:sz w:val="28"/>
+                <w:szCs w:val="28"/>
+              </w:rPr>
+              <w:t xml:space="preserve">                    6.1.1 Sequential Execution Steps</w:t>
+            </w:r>
+          </w:p>
+        </w:tc>
+        <w:tc>
+          <w:tcPr>
+            <w:tcW w:w="1615" w:type="dxa"/>
+          </w:tcPr>
+          <w:p>
+            <w:pPr>
+              <w:jc w:val="right"/>
+              <w:rPr>
+                <w:sz w:val="28"/>
+                <w:szCs w:val="28"/>
+              </w:rPr>
+            </w:pPr>
+            <w:r>
+              <w:rPr>
+                <w:sz w:val="28"/>
+                <w:szCs w:val="28"/>
+              </w:rPr>
+              <w:t>1</w:t>
+            </w:r>
+            <w:r>
+              <w:rPr>
+                <w:sz w:val="28"/>
+                <w:szCs w:val="28"/>
+              </w:rPr>
+              <w:t>5</w:t>
+            </w:r>
+          </w:p>
+        </w:tc>
+      </w:tr>
+      <w:tr>
+        <w:tc>
+          <w:tcPr>
+            <w:tcW w:w="7735" w:type="dxa"/>
+          </w:tcPr>
+          <w:p>
+            <w:pPr>
+              <w:rPr>
+                <w:sz w:val="28"/>
+                <w:szCs w:val="28"/>
+              </w:rPr>
+            </w:pPr>
+            <w:r>
+              <w:rPr>
+                <w:sz w:val="28"/>
+                <w:szCs w:val="28"/>
+              </w:rPr>
+              <w:t xml:space="preserve">              6.2 Risk Management </w:t>
+            </w:r>
+          </w:p>
+        </w:tc>
+        <w:tc>
+          <w:tcPr>
+            <w:tcW w:w="1615" w:type="dxa"/>
+          </w:tcPr>
+          <w:p>
+            <w:pPr>
+              <w:jc w:val="right"/>
+              <w:rPr>
+                <w:sz w:val="28"/>
+                <w:szCs w:val="28"/>
+              </w:rPr>
+            </w:pPr>
+            <w:r>
+              <w:rPr>
+                <w:sz w:val="28"/>
+                <w:szCs w:val="28"/>
+              </w:rPr>
+              <w:t>17</w:t>
+            </w:r>
+          </w:p>
+        </w:tc>
+      </w:tr>
+      <w:tr>
+        <w:tc>
+          <w:tcPr>
+            <w:tcW w:w="7735" w:type="dxa"/>
+          </w:tcPr>
+          <w:p>
+            <w:pPr>
+              <w:rPr>
+                <w:sz w:val="28"/>
+                <w:szCs w:val="28"/>
+              </w:rPr>
+            </w:pPr>
+            <w:r>
+              <w:rPr>
+                <w:sz w:val="28"/>
+                <w:szCs w:val="28"/>
+              </w:rPr>
+              <w:t xml:space="preserve">                    6.2.1 Technical Risks</w:t>
+            </w:r>
+          </w:p>
+        </w:tc>
+        <w:tc>
+          <w:tcPr>
+            <w:tcW w:w="1615" w:type="dxa"/>
+          </w:tcPr>
+          <w:p>
+            <w:pPr>
+              <w:jc w:val="right"/>
+              <w:rPr>
+                <w:sz w:val="28"/>
+                <w:szCs w:val="28"/>
+              </w:rPr>
+            </w:pPr>
+            <w:r>
+              <w:rPr>
+                <w:sz w:val="28"/>
+                <w:szCs w:val="28"/>
+              </w:rPr>
+              <w:t>17</w:t>
+            </w:r>
+          </w:p>
+        </w:tc>
+      </w:tr>
+      <w:tr>
+        <w:tc>
+          <w:tcPr>
+            <w:tcW w:w="7735" w:type="dxa"/>
+          </w:tcPr>
+          <w:p>
+            <w:pPr>
+              <w:rPr>
+                <w:sz w:val="28"/>
+                <w:szCs w:val="28"/>
+              </w:rPr>
+            </w:pPr>
+            <w:r>
+              <w:rPr>
+                <w:sz w:val="28"/>
+                <w:szCs w:val="28"/>
+              </w:rPr>
+              <w:t xml:space="preserve">                    6.2.2 Operational Risks</w:t>
+            </w:r>
+          </w:p>
+        </w:tc>
+        <w:tc>
+          <w:tcPr>
+            <w:tcW w:w="1615" w:type="dxa"/>
+          </w:tcPr>
+          <w:p>
+            <w:pPr>
+              <w:jc w:val="right"/>
+              <w:rPr>
+                <w:sz w:val="28"/>
+                <w:szCs w:val="28"/>
+              </w:rPr>
+            </w:pPr>
+            <w:r>
+              <w:rPr>
+                <w:sz w:val="28"/>
+                <w:szCs w:val="28"/>
+              </w:rPr>
+              <w:t>17</w:t>
+            </w:r>
+          </w:p>
+        </w:tc>
+      </w:tr>
+      <w:tr>
+        <w:tc>
+          <w:tcPr>
+            <w:tcW w:w="7735" w:type="dxa"/>
+          </w:tcPr>
+          <w:p>
+            <w:pPr>
+              <w:rPr>
+                <w:sz w:val="28"/>
+                <w:szCs w:val="28"/>
+              </w:rPr>
+            </w:pPr>
+            <w:r>
+              <w:rPr>
+                <w:sz w:val="28"/>
+                <w:szCs w:val="28"/>
+              </w:rPr>
+              <w:t xml:space="preserve">              </w:t>
+            </w:r>
+            <w:r>
+              <w:rPr>
+                <w:sz w:val="28"/>
+                <w:szCs w:val="28"/>
+              </w:rPr>
+              <w:t>6.3 Success Criteria</w:t>
+            </w:r>
+          </w:p>
+        </w:tc>
+        <w:tc>
+          <w:tcPr>
+            <w:tcW w:w="1615" w:type="dxa"/>
+          </w:tcPr>
+          <w:p>
+            <w:pPr>
+              <w:jc w:val="right"/>
+              <w:rPr>
+                <w:sz w:val="28"/>
+                <w:szCs w:val="28"/>
+              </w:rPr>
+            </w:pPr>
+            <w:r>
+              <w:rPr>
+                <w:sz w:val="28"/>
+                <w:szCs w:val="28"/>
+              </w:rPr>
+              <w:t>17</w:t>
+            </w:r>
+          </w:p>
+        </w:tc>
+      </w:tr>
+      <w:tr>
+        <w:tc>
+          <w:tcPr>
+            <w:tcW w:w="7735" w:type="dxa"/>
+          </w:tcPr>
+          <w:p>
+            <w:pPr>
+              <w:rPr>
+                <w:sz w:val="28"/>
+                <w:szCs w:val="28"/>
+              </w:rPr>
+            </w:pPr>
+            <w:r>
+              <w:rPr>
+                <w:sz w:val="28"/>
+                <w:szCs w:val="28"/>
+              </w:rPr>
+              <w:t xml:space="preserve">                    </w:t>
+            </w:r>
+            <w:r>
+              <w:rPr>
+                <w:sz w:val="28"/>
+                <w:szCs w:val="28"/>
+              </w:rPr>
+              <w:t>6.3.1 Technical Metrics</w:t>
+            </w:r>
+          </w:p>
+        </w:tc>
+        <w:tc>
+          <w:tcPr>
+            <w:tcW w:w="1615" w:type="dxa"/>
+          </w:tcPr>
+          <w:p>
+            <w:pPr>
+              <w:jc w:val="right"/>
+              <w:rPr>
+                <w:sz w:val="28"/>
+                <w:szCs w:val="28"/>
+              </w:rPr>
+            </w:pPr>
+            <w:r>
+              <w:rPr>
+                <w:sz w:val="28"/>
+                <w:szCs w:val="28"/>
+              </w:rPr>
+              <w:t>17</w:t>
+            </w:r>
+          </w:p>
+        </w:tc>
+      </w:tr>
+      <w:tr>
+        <w:tc>
+          <w:tcPr>
+            <w:tcW w:w="7735" w:type="dxa"/>
+          </w:tcPr>
+          <w:p>
+            <w:pPr>
+              <w:rPr>
+                <w:sz w:val="28"/>
+                <w:szCs w:val="28"/>
+              </w:rPr>
+            </w:pPr>
+            <w:r>
+              <w:rPr>
+                <w:sz w:val="28"/>
+                <w:szCs w:val="28"/>
+              </w:rPr>
+              <w:t xml:space="preserve">                    </w:t>
+            </w:r>
+            <w:r>
+              <w:rPr>
+                <w:sz w:val="28"/>
+                <w:szCs w:val="28"/>
+              </w:rPr>
+              <w:t>6.3.2 System Performance Metrics</w:t>
+            </w:r>
+          </w:p>
+        </w:tc>
+        <w:tc>
+          <w:tcPr>
+            <w:tcW w:w="1615" w:type="dxa"/>
+          </w:tcPr>
+          <w:p>
+            <w:pPr>
+              <w:jc w:val="right"/>
+              <w:rPr>
+                <w:sz w:val="28"/>
+                <w:szCs w:val="28"/>
+              </w:rPr>
+            </w:pPr>
+            <w:r>
+              <w:rPr>
+                <w:sz w:val="28"/>
+                <w:szCs w:val="28"/>
+              </w:rPr>
+              <w:t>1</w:t>
+            </w:r>
+            <w:r>
+              <w:rPr>
+                <w:sz w:val="28"/>
+                <w:szCs w:val="28"/>
+              </w:rPr>
+              <w:t>8</w:t>
+            </w:r>
+          </w:p>
+        </w:tc>
+      </w:tr>
+      <w:tr>
+        <w:tc>
+          <w:tcPr>
+            <w:tcW w:w="7735" w:type="dxa"/>
+          </w:tcPr>
+          <w:p>
+            <w:pPr>
+              <w:rPr>
+                <w:sz w:val="28"/>
+                <w:szCs w:val="28"/>
+              </w:rPr>
+            </w:pPr>
+            <w:r>
+              <w:rPr>
+                <w:sz w:val="28"/>
+                <w:szCs w:val="28"/>
+              </w:rPr>
+              <w:t xml:space="preserve">                    </w:t>
+            </w:r>
+            <w:r>
+              <w:rPr>
+                <w:sz w:val="28"/>
+                <w:szCs w:val="28"/>
+              </w:rPr>
+              <w:t xml:space="preserve">6.3.3 Business Metrics </w:t>
+            </w:r>
+          </w:p>
+        </w:tc>
+        <w:tc>
+          <w:tcPr>
+            <w:tcW w:w="1615" w:type="dxa"/>
+          </w:tcPr>
+          <w:p>
+            <w:pPr>
+              <w:jc w:val="right"/>
+              <w:rPr>
+                <w:sz w:val="28"/>
+                <w:szCs w:val="28"/>
+              </w:rPr>
+            </w:pPr>
+            <w:r>
+              <w:rPr>
+                <w:sz w:val="28"/>
+                <w:szCs w:val="28"/>
+              </w:rPr>
+              <w:t>1</w:t>
+            </w:r>
+            <w:r>
+              <w:rPr>
+                <w:sz w:val="28"/>
+                <w:szCs w:val="28"/>
+              </w:rPr>
+              <w:t>8</w:t>
+            </w:r>
+          </w:p>
+        </w:tc>
+      </w:tr>
+      <w:tr>
+        <w:tc>
+          <w:tcPr>
+            <w:tcW w:w="7735" w:type="dxa"/>
+          </w:tcPr>
+          <w:p>
+            <w:pPr>
+              <w:rPr>
+                <w:sz w:val="28"/>
+                <w:szCs w:val="28"/>
+              </w:rPr>
+            </w:pPr>
+            <w:r>
+              <w:rPr>
+                <w:sz w:val="28"/>
+                <w:szCs w:val="28"/>
+              </w:rPr>
+              <w:lastRenderedPageBreak/>
+              <w:t xml:space="preserve">              </w:t>
+            </w:r>
+            <w:r>
+              <w:rPr>
+                <w:sz w:val="28"/>
+                <w:szCs w:val="28"/>
+              </w:rPr>
+              <w:t>6.4 Functional Requirements</w:t>
+            </w:r>
+          </w:p>
+        </w:tc>
+        <w:tc>
+          <w:tcPr>
+            <w:tcW w:w="1615" w:type="dxa"/>
+          </w:tcPr>
+          <w:p>
+            <w:pPr>
+              <w:jc w:val="right"/>
+              <w:rPr>
+                <w:sz w:val="28"/>
+                <w:szCs w:val="28"/>
+              </w:rPr>
+            </w:pPr>
+            <w:r>
+              <w:rPr>
+                <w:sz w:val="28"/>
+                <w:szCs w:val="28"/>
+              </w:rPr>
+              <w:t>19</w:t>
+            </w:r>
+          </w:p>
+        </w:tc>
+      </w:tr>
+      <w:tr>
+        <w:tc>
+          <w:tcPr>
+            <w:tcW w:w="7735" w:type="dxa"/>
+          </w:tcPr>
+          <w:p>
+            <w:pPr>
+              <w:rPr>
+                <w:sz w:val="28"/>
+                <w:szCs w:val="28"/>
+              </w:rPr>
+            </w:pPr>
+            <w:r>
+              <w:rPr>
+                <w:sz w:val="28"/>
+                <w:szCs w:val="28"/>
+              </w:rPr>
+              <w:t xml:space="preserve">                    </w:t>
+            </w:r>
+            <w:r>
+              <w:rPr>
+                <w:sz w:val="28"/>
+                <w:szCs w:val="28"/>
+              </w:rPr>
+              <w:t>6.4.1 Core System Capabilities</w:t>
+            </w:r>
+          </w:p>
+        </w:tc>
+        <w:tc>
+          <w:tcPr>
+            <w:tcW w:w="1615" w:type="dxa"/>
+          </w:tcPr>
+          <w:p>
+            <w:pPr>
+              <w:jc w:val="right"/>
+              <w:rPr>
+                <w:sz w:val="28"/>
+                <w:szCs w:val="28"/>
+              </w:rPr>
+            </w:pPr>
+            <w:r>
+              <w:rPr>
+                <w:sz w:val="28"/>
+                <w:szCs w:val="28"/>
+              </w:rPr>
+              <w:t>19</w:t>
+            </w:r>
+          </w:p>
+        </w:tc>
+      </w:tr>
+      <w:tr>
+        <w:tc>
+          <w:tcPr>
+            <w:tcW w:w="7735" w:type="dxa"/>
+          </w:tcPr>
+          <w:p>
+            <w:pPr>
+              <w:rPr>
+                <w:sz w:val="28"/>
+                <w:szCs w:val="28"/>
+              </w:rPr>
+            </w:pPr>
+            <w:r>
+              <w:rPr>
+                <w:sz w:val="28"/>
+                <w:szCs w:val="28"/>
+              </w:rPr>
+              <w:t xml:space="preserve">              </w:t>
+            </w:r>
+            <w:r>
+              <w:rPr>
+                <w:sz w:val="28"/>
+                <w:szCs w:val="28"/>
+              </w:rPr>
+              <w:t>6.5 Coding Explaination</w:t>
+            </w:r>
+          </w:p>
+        </w:tc>
+        <w:tc>
+          <w:tcPr>
+            <w:tcW w:w="1615" w:type="dxa"/>
+          </w:tcPr>
+          <w:p>
+            <w:pPr>
+              <w:jc w:val="right"/>
+              <w:rPr>
+                <w:sz w:val="28"/>
+                <w:szCs w:val="28"/>
+              </w:rPr>
+            </w:pPr>
+            <w:r>
+              <w:rPr>
+                <w:sz w:val="28"/>
+                <w:szCs w:val="28"/>
+              </w:rPr>
+              <w:t>19-26</w:t>
+            </w:r>
+          </w:p>
+        </w:tc>
+      </w:tr>
+      <w:tr>
+        <w:tc>
+          <w:tcPr>
+            <w:tcW w:w="7735" w:type="dxa"/>
+          </w:tcPr>
+          <w:p>
+            <w:pPr>
+              <w:rPr>
+                <w:sz w:val="28"/>
+                <w:szCs w:val="28"/>
+              </w:rPr>
+            </w:pPr>
           </w:p>
         </w:tc>
         <w:tc>
@@ -1751,7 +2589,7 @@
                 <w:sz w:val="28"/>
                 <w:szCs w:val="28"/>
               </w:rPr>
-              <w:t>CHAPTER 5: PROJECT PLAN</w:t>
+              <w:t xml:space="preserve">CHAPTER 7: CONCLUSION </w:t>
             </w:r>
           </w:p>
         </w:tc>
@@ -1772,7 +2610,7 @@
                 <w:sz w:val="28"/>
                 <w:szCs w:val="28"/>
               </w:rPr>
-              <w:t>15</w:t>
+              <w:t>27</w:t>
             </w:r>
           </w:p>
         </w:tc>
@@ -1789,29 +2627,6 @@
                 <w:szCs w:val="28"/>
               </w:rPr>
             </w:pPr>
-            <w:r>
-              <w:rPr>
-                <w:sz w:val="28"/>
-                <w:szCs w:val="28"/>
-              </w:rPr>
-              <w:t xml:space="preserve">              5.1 List </w:t>
-            </w:r>
-            <w:proofErr w:type="gramStart"/>
-            <w:r>
-              <w:rPr>
-                <w:sz w:val="28"/>
-                <w:szCs w:val="28"/>
-              </w:rPr>
-              <w:t>Of</w:t>
-            </w:r>
-            <w:proofErr w:type="gramEnd"/>
-            <w:r>
-              <w:rPr>
-                <w:sz w:val="28"/>
-                <w:szCs w:val="28"/>
-              </w:rPr>
-              <w:t xml:space="preserve"> Major Activities </w:t>
-            </w:r>
           </w:p>
         </w:tc>
         <w:tc>
@@ -1820,86 +2635,6 @@
           </w:tcPr>
           <w:p>
             <w:pPr>
-              <w:jc w:val="right"/>
-              <w:rPr>
-                <w:sz w:val="28"/>
-                <w:szCs w:val="28"/>
-              </w:rPr>
-            </w:pPr>
-            <w:r>
-              <w:rPr>
-                <w:sz w:val="28"/>
-                <w:szCs w:val="28"/>
-              </w:rPr>
-              <w:t>15</w:t>
-            </w:r>
-          </w:p>
-        </w:tc>
-      </w:tr>
-      <w:tr>
-        <w:tc>
-          <w:tcPr>
-            <w:tcW w:w="7735" w:type="dxa"/>
-          </w:tcPr>
-          <w:p>
-            <w:pPr>
-              <w:rPr>
-                <w:sz w:val="28"/>
-                <w:szCs w:val="28"/>
-              </w:rPr>
-            </w:pPr>
-            <w:r>
-              <w:rPr>
-                <w:sz w:val="28"/>
-                <w:szCs w:val="28"/>
-              </w:rPr>
-              <w:t xml:space="preserve">              5.2 Estimated Time Durations</w:t>
-            </w:r>
-          </w:p>
-        </w:tc>
-        <w:tc>
-          <w:tcPr>
-            <w:tcW w:w="1615" w:type="dxa"/>
-          </w:tcPr>
-          <w:p>
-            <w:pPr>
-              <w:jc w:val="right"/>
-              <w:rPr>
-                <w:sz w:val="28"/>
-                <w:szCs w:val="28"/>
-              </w:rPr>
-            </w:pPr>
-            <w:r>
-              <w:rPr>
-                <w:sz w:val="28"/>
-                <w:szCs w:val="28"/>
-              </w:rPr>
-              <w:t>16</w:t>
-            </w:r>
-          </w:p>
-        </w:tc>
-      </w:tr>
-      <w:tr>
-        <w:tc>
-          <w:tcPr>
-            <w:tcW w:w="7735" w:type="dxa"/>
-          </w:tcPr>
-          <w:p>
-            <w:pPr>
-              <w:rPr>
-                <w:sz w:val="28"/>
-                <w:szCs w:val="28"/>
-              </w:rPr>
-            </w:pPr>
-          </w:p>
-        </w:tc>
-        <w:tc>
-          <w:tcPr>
-            <w:tcW w:w="1615" w:type="dxa"/>
-          </w:tcPr>
-          <w:p>
-            <w:pPr>
-              <w:jc w:val="right"/>
               <w:rPr>
                 <w:sz w:val="28"/>
                 <w:szCs w:val="28"/>
@@ -1925,724 +2660,6 @@
                 <w:sz w:val="28"/>
                 <w:szCs w:val="28"/>
               </w:rPr>
-              <w:t>CHAPTER 6: IMPLEMENTATION DETAILS</w:t>
-            </w:r>
-          </w:p>
-        </w:tc>
-        <w:tc>
-          <w:tcPr>
-            <w:tcW w:w="1615" w:type="dxa"/>
-          </w:tcPr>
-          <w:p>
-            <w:pPr>
-              <w:jc w:val="right"/>
-              <w:rPr>
-                <w:sz w:val="28"/>
-                <w:szCs w:val="28"/>
-              </w:rPr>
-            </w:pPr>
-            <w:r>
-              <w:rPr>
-                <w:sz w:val="28"/>
-                <w:szCs w:val="28"/>
-              </w:rPr>
-              <w:t>18</w:t>
-            </w:r>
-          </w:p>
-        </w:tc>
-      </w:tr>
-      <w:tr>
-        <w:tc>
-          <w:tcPr>
-            <w:tcW w:w="7735" w:type="dxa"/>
-          </w:tcPr>
-          <w:p>
-            <w:pPr>
-              <w:rPr>
-                <w:sz w:val="28"/>
-                <w:szCs w:val="28"/>
-              </w:rPr>
-            </w:pPr>
-            <w:r>
-              <w:rPr>
-                <w:sz w:val="28"/>
-                <w:szCs w:val="28"/>
-              </w:rPr>
-              <w:t xml:space="preserve">              6.1 Project Execution Workflow</w:t>
-            </w:r>
-          </w:p>
-        </w:tc>
-        <w:tc>
-          <w:tcPr>
-            <w:tcW w:w="1615" w:type="dxa"/>
-          </w:tcPr>
-          <w:p>
-            <w:pPr>
-              <w:jc w:val="right"/>
-              <w:rPr>
-                <w:sz w:val="28"/>
-                <w:szCs w:val="28"/>
-              </w:rPr>
-            </w:pPr>
-            <w:r>
-              <w:rPr>
-                <w:sz w:val="28"/>
-                <w:szCs w:val="28"/>
-              </w:rPr>
-              <w:t>18</w:t>
-            </w:r>
-          </w:p>
-        </w:tc>
-      </w:tr>
-      <w:tr>
-        <w:tc>
-          <w:tcPr>
-            <w:tcW w:w="7735" w:type="dxa"/>
-          </w:tcPr>
-          <w:p>
-            <w:pPr>
-              <w:rPr>
-                <w:sz w:val="28"/>
-                <w:szCs w:val="28"/>
-              </w:rPr>
-            </w:pPr>
-            <w:r>
-              <w:rPr>
-                <w:sz w:val="28"/>
-                <w:szCs w:val="28"/>
-              </w:rPr>
-              <w:t xml:space="preserve">                    6.1.1 Sequential Execution Steps</w:t>
-            </w:r>
-          </w:p>
-        </w:tc>
-        <w:tc>
-          <w:tcPr>
-            <w:tcW w:w="1615" w:type="dxa"/>
-          </w:tcPr>
-          <w:p>
-            <w:pPr>
-              <w:jc w:val="right"/>
-              <w:rPr>
-                <w:sz w:val="28"/>
-                <w:szCs w:val="28"/>
-              </w:rPr>
-            </w:pPr>
-            <w:r>
-              <w:rPr>
-                <w:sz w:val="28"/>
-                <w:szCs w:val="28"/>
-              </w:rPr>
-              <w:t>18</w:t>
-            </w:r>
-          </w:p>
-        </w:tc>
-      </w:tr>
-      <w:tr>
-        <w:tc>
-          <w:tcPr>
-            <w:tcW w:w="7735" w:type="dxa"/>
-          </w:tcPr>
-          <w:p>
-            <w:pPr>
-              <w:rPr>
-                <w:sz w:val="28"/>
-                <w:szCs w:val="28"/>
-              </w:rPr>
-            </w:pPr>
-            <w:r>
-              <w:rPr>
-                <w:sz w:val="28"/>
-                <w:szCs w:val="28"/>
-              </w:rPr>
-              <w:t xml:space="preserve">              6.2 Risk Management </w:t>
-            </w:r>
-          </w:p>
-        </w:tc>
-        <w:tc>
-          <w:tcPr>
-            <w:tcW w:w="1615" w:type="dxa"/>
-          </w:tcPr>
-          <w:p>
-            <w:pPr>
-              <w:jc w:val="right"/>
-              <w:rPr>
-                <w:sz w:val="28"/>
-                <w:szCs w:val="28"/>
-              </w:rPr>
-            </w:pPr>
-            <w:r>
-              <w:rPr>
-                <w:sz w:val="28"/>
-                <w:szCs w:val="28"/>
-              </w:rPr>
-              <w:t>20</w:t>
-            </w:r>
-          </w:p>
-        </w:tc>
-      </w:tr>
-      <w:tr>
-        <w:tc>
-          <w:tcPr>
-            <w:tcW w:w="7735" w:type="dxa"/>
-          </w:tcPr>
-          <w:p>
-            <w:pPr>
-              <w:rPr>
-                <w:sz w:val="28"/>
-                <w:szCs w:val="28"/>
-              </w:rPr>
-            </w:pPr>
-            <w:r>
-              <w:rPr>
-                <w:sz w:val="28"/>
-                <w:szCs w:val="28"/>
-              </w:rPr>
-              <w:t xml:space="preserve">                    6.2.1 Technical Risks</w:t>
-            </w:r>
-          </w:p>
-        </w:tc>
-        <w:tc>
-          <w:tcPr>
-            <w:tcW w:w="1615" w:type="dxa"/>
-          </w:tcPr>
-          <w:p>
-            <w:pPr>
-              <w:jc w:val="right"/>
-              <w:rPr>
-                <w:sz w:val="28"/>
-                <w:szCs w:val="28"/>
-              </w:rPr>
-            </w:pPr>
-            <w:r>
-              <w:rPr>
-                <w:sz w:val="28"/>
-                <w:szCs w:val="28"/>
-              </w:rPr>
-              <w:t>20</w:t>
-            </w:r>
-          </w:p>
-        </w:tc>
-      </w:tr>
-      <w:tr>
-        <w:tc>
-          <w:tcPr>
-            <w:tcW w:w="7735" w:type="dxa"/>
-          </w:tcPr>
-          <w:p>
-            <w:pPr>
-              <w:rPr>
-                <w:sz w:val="28"/>
-                <w:szCs w:val="28"/>
-              </w:rPr>
-            </w:pPr>
-            <w:r>
-              <w:rPr>
-                <w:sz w:val="28"/>
-                <w:szCs w:val="28"/>
-              </w:rPr>
-              <w:t xml:space="preserve">                    6.2.2 Operational Risks</w:t>
-            </w:r>
-          </w:p>
-        </w:tc>
-        <w:tc>
-          <w:tcPr>
-            <w:tcW w:w="1615" w:type="dxa"/>
-          </w:tcPr>
-          <w:p>
-            <w:pPr>
-              <w:jc w:val="right"/>
-              <w:rPr>
-                <w:sz w:val="28"/>
-                <w:szCs w:val="28"/>
-              </w:rPr>
-            </w:pPr>
-            <w:r>
-              <w:rPr>
-                <w:sz w:val="28"/>
-                <w:szCs w:val="28"/>
-              </w:rPr>
-              <w:t>20</w:t>
-            </w:r>
-          </w:p>
-        </w:tc>
-      </w:tr>
-      <w:tr>
-        <w:tc>
-          <w:tcPr>
-            <w:tcW w:w="7735" w:type="dxa"/>
-          </w:tcPr>
-          <w:p>
-            <w:pPr>
-              <w:rPr>
-                <w:sz w:val="28"/>
-                <w:szCs w:val="28"/>
-              </w:rPr>
-            </w:pPr>
-            <w:r>
-              <w:rPr>
-                <w:sz w:val="28"/>
-                <w:szCs w:val="28"/>
-              </w:rPr>
-              <w:t xml:space="preserve">              </w:t>
-            </w:r>
-            <w:r>
-              <w:rPr>
-                <w:sz w:val="28"/>
-                <w:szCs w:val="28"/>
-              </w:rPr>
-              <w:t>6.3 Success Criteria</w:t>
-            </w:r>
-          </w:p>
-        </w:tc>
-        <w:tc>
-          <w:tcPr>
-            <w:tcW w:w="1615" w:type="dxa"/>
-          </w:tcPr>
-          <w:p>
-            <w:pPr>
-              <w:jc w:val="right"/>
-              <w:rPr>
-                <w:sz w:val="28"/>
-                <w:szCs w:val="28"/>
-              </w:rPr>
-            </w:pPr>
-            <w:r>
-              <w:rPr>
-                <w:sz w:val="28"/>
-                <w:szCs w:val="28"/>
-              </w:rPr>
-              <w:t>20</w:t>
-            </w:r>
-          </w:p>
-        </w:tc>
-      </w:tr>
-      <w:tr>
-        <w:tc>
-          <w:tcPr>
-            <w:tcW w:w="7735" w:type="dxa"/>
-          </w:tcPr>
-          <w:p>
-            <w:pPr>
-              <w:rPr>
-                <w:sz w:val="28"/>
-                <w:szCs w:val="28"/>
-              </w:rPr>
-            </w:pPr>
-            <w:r>
-              <w:rPr>
-                <w:sz w:val="28"/>
-                <w:szCs w:val="28"/>
-              </w:rPr>
-              <w:t xml:space="preserve">                    </w:t>
-            </w:r>
-            <w:r>
-              <w:rPr>
-                <w:sz w:val="28"/>
-                <w:szCs w:val="28"/>
-              </w:rPr>
-              <w:t>6.3.1 Technical Metrics</w:t>
-            </w:r>
-          </w:p>
-        </w:tc>
-        <w:tc>
-          <w:tcPr>
-            <w:tcW w:w="1615" w:type="dxa"/>
-          </w:tcPr>
-          <w:p>
-            <w:pPr>
-              <w:jc w:val="right"/>
-              <w:rPr>
-                <w:sz w:val="28"/>
-                <w:szCs w:val="28"/>
-              </w:rPr>
-            </w:pPr>
-            <w:r>
-              <w:rPr>
-                <w:sz w:val="28"/>
-                <w:szCs w:val="28"/>
-              </w:rPr>
-              <w:t>20</w:t>
-            </w:r>
-          </w:p>
-        </w:tc>
-      </w:tr>
-      <w:tr>
-        <w:tc>
-          <w:tcPr>
-            <w:tcW w:w="7735" w:type="dxa"/>
-          </w:tcPr>
-          <w:p>
-            <w:pPr>
-              <w:rPr>
-                <w:sz w:val="28"/>
-                <w:szCs w:val="28"/>
-              </w:rPr>
-            </w:pPr>
-            <w:r>
-              <w:rPr>
-                <w:sz w:val="28"/>
-                <w:szCs w:val="28"/>
-              </w:rPr>
-              <w:t xml:space="preserve">                    </w:t>
-            </w:r>
-            <w:r>
-              <w:rPr>
-                <w:sz w:val="28"/>
-                <w:szCs w:val="28"/>
-              </w:rPr>
-              <w:t>6.3.2 System Performance Metrics</w:t>
-            </w:r>
-          </w:p>
-        </w:tc>
-        <w:tc>
-          <w:tcPr>
-            <w:tcW w:w="1615" w:type="dxa"/>
-          </w:tcPr>
-          <w:p>
-            <w:pPr>
-              <w:jc w:val="right"/>
-              <w:rPr>
-                <w:sz w:val="28"/>
-                <w:szCs w:val="28"/>
-              </w:rPr>
-            </w:pPr>
-            <w:r>
-              <w:rPr>
-                <w:sz w:val="28"/>
-                <w:szCs w:val="28"/>
-              </w:rPr>
-              <w:t>21</w:t>
-            </w:r>
-          </w:p>
-        </w:tc>
-      </w:tr>
-      <w:tr>
-        <w:tc>
-          <w:tcPr>
-            <w:tcW w:w="7735" w:type="dxa"/>
-          </w:tcPr>
-          <w:p>
-            <w:pPr>
-              <w:rPr>
-                <w:sz w:val="28"/>
-                <w:szCs w:val="28"/>
-              </w:rPr>
-            </w:pPr>
-            <w:r>
-              <w:rPr>
-                <w:sz w:val="28"/>
-                <w:szCs w:val="28"/>
-              </w:rPr>
-              <w:t xml:space="preserve">                    </w:t>
-            </w:r>
-            <w:r>
-              <w:rPr>
-                <w:sz w:val="28"/>
-                <w:szCs w:val="28"/>
-              </w:rPr>
-              <w:t xml:space="preserve">6.3.3 Business Metrics </w:t>
-            </w:r>
-          </w:p>
-        </w:tc>
-        <w:tc>
-          <w:tcPr>
-            <w:tcW w:w="1615" w:type="dxa"/>
-          </w:tcPr>
-          <w:p>
-            <w:pPr>
-              <w:jc w:val="right"/>
-              <w:rPr>
-                <w:sz w:val="28"/>
-                <w:szCs w:val="28"/>
-              </w:rPr>
-            </w:pPr>
-            <w:r>
-              <w:rPr>
-                <w:sz w:val="28"/>
-                <w:szCs w:val="28"/>
-              </w:rPr>
-              <w:t>21</w:t>
-            </w:r>
-          </w:p>
-        </w:tc>
-      </w:tr>
-      <w:tr>
-        <w:tc>
-          <w:tcPr>
-            <w:tcW w:w="7735" w:type="dxa"/>
-          </w:tcPr>
-          <w:p>
-            <w:pPr>
-              <w:rPr>
-                <w:sz w:val="28"/>
-                <w:szCs w:val="28"/>
-              </w:rPr>
-            </w:pPr>
-            <w:r>
-              <w:rPr>
-                <w:sz w:val="28"/>
-                <w:szCs w:val="28"/>
-              </w:rPr>
-              <w:lastRenderedPageBreak/>
-              <w:t xml:space="preserve">              </w:t>
-            </w:r>
-            <w:r>
-              <w:rPr>
-                <w:sz w:val="28"/>
-                <w:szCs w:val="28"/>
-              </w:rPr>
-              <w:t>6.4 Functional Requirements</w:t>
-            </w:r>
-          </w:p>
-        </w:tc>
-        <w:tc>
-          <w:tcPr>
-            <w:tcW w:w="1615" w:type="dxa"/>
-          </w:tcPr>
-          <w:p>
-            <w:pPr>
-              <w:jc w:val="right"/>
-              <w:rPr>
-                <w:sz w:val="28"/>
-                <w:szCs w:val="28"/>
-              </w:rPr>
-            </w:pPr>
-            <w:r>
-              <w:rPr>
-                <w:sz w:val="28"/>
-                <w:szCs w:val="28"/>
-              </w:rPr>
-              <w:t>22</w:t>
-            </w:r>
-          </w:p>
-        </w:tc>
-      </w:tr>
-      <w:tr>
-        <w:tc>
-          <w:tcPr>
-            <w:tcW w:w="7735" w:type="dxa"/>
-          </w:tcPr>
-          <w:p>
-            <w:pPr>
-              <w:rPr>
-                <w:sz w:val="28"/>
-                <w:szCs w:val="28"/>
-              </w:rPr>
-            </w:pPr>
-            <w:r>
-              <w:rPr>
-                <w:sz w:val="28"/>
-                <w:szCs w:val="28"/>
-              </w:rPr>
-              <w:t xml:space="preserve">                    </w:t>
-            </w:r>
-            <w:r>
-              <w:rPr>
-                <w:sz w:val="28"/>
-                <w:szCs w:val="28"/>
-              </w:rPr>
-              <w:t>6.4.1 Core System Capabilities</w:t>
-            </w:r>
-          </w:p>
-        </w:tc>
-        <w:tc>
-          <w:tcPr>
-            <w:tcW w:w="1615" w:type="dxa"/>
-          </w:tcPr>
-          <w:p>
-            <w:pPr>
-              <w:jc w:val="right"/>
-              <w:rPr>
-                <w:sz w:val="28"/>
-                <w:szCs w:val="28"/>
-              </w:rPr>
-            </w:pPr>
-            <w:r>
-              <w:rPr>
-                <w:sz w:val="28"/>
-                <w:szCs w:val="28"/>
-              </w:rPr>
-              <w:t>22</w:t>
-            </w:r>
-          </w:p>
-        </w:tc>
-      </w:tr>
-      <w:tr>
-        <w:tc>
-          <w:tcPr>
-            <w:tcW w:w="7735" w:type="dxa"/>
-          </w:tcPr>
-          <w:p>
-            <w:pPr>
-              <w:rPr>
-                <w:sz w:val="28"/>
-                <w:szCs w:val="28"/>
-              </w:rPr>
-            </w:pPr>
-            <w:r>
-              <w:rPr>
-                <w:sz w:val="28"/>
-                <w:szCs w:val="28"/>
-              </w:rPr>
-              <w:t xml:space="preserve">              </w:t>
-            </w:r>
-            <w:r>
-              <w:rPr>
-                <w:sz w:val="28"/>
-                <w:szCs w:val="28"/>
-              </w:rPr>
-              <w:t xml:space="preserve">6.5 Coding </w:t>
-            </w:r>
-            <w:proofErr w:type="spellStart"/>
-            <w:r>
-              <w:rPr>
-                <w:sz w:val="28"/>
-                <w:szCs w:val="28"/>
-              </w:rPr>
-              <w:t>Explaination</w:t>
-            </w:r>
-            <w:proofErr w:type="spellEnd"/>
-          </w:p>
-        </w:tc>
-        <w:tc>
-          <w:tcPr>
-            <w:tcW w:w="1615" w:type="dxa"/>
-          </w:tcPr>
-          <w:p>
-            <w:pPr>
-              <w:jc w:val="right"/>
-              <w:rPr>
-                <w:sz w:val="28"/>
-                <w:szCs w:val="28"/>
-              </w:rPr>
-            </w:pPr>
-            <w:r>
-              <w:rPr>
-                <w:sz w:val="28"/>
-                <w:szCs w:val="28"/>
-              </w:rPr>
-              <w:t>22-29</w:t>
-            </w:r>
-          </w:p>
-        </w:tc>
-      </w:tr>
-      <w:tr>
-        <w:tc>
-          <w:tcPr>
-            <w:tcW w:w="7735" w:type="dxa"/>
-          </w:tcPr>
-          <w:p>
-            <w:pPr>
-              <w:rPr>
-                <w:sz w:val="28"/>
-                <w:szCs w:val="28"/>
-              </w:rPr>
-            </w:pPr>
-          </w:p>
-        </w:tc>
-        <w:tc>
-          <w:tcPr>
-            <w:tcW w:w="1615" w:type="dxa"/>
-          </w:tcPr>
-          <w:p>
-            <w:pPr>
-              <w:jc w:val="right"/>
-              <w:rPr>
-                <w:sz w:val="28"/>
-                <w:szCs w:val="28"/>
-              </w:rPr>
-            </w:pPr>
-          </w:p>
-        </w:tc>
-      </w:tr>
-      <w:tr>
-        <w:tc>
-          <w:tcPr>
-            <w:tcW w:w="7735" w:type="dxa"/>
-          </w:tcPr>
-          <w:p>
-            <w:pPr>
-              <w:rPr>
-                <w:sz w:val="28"/>
-                <w:szCs w:val="28"/>
-              </w:rPr>
-            </w:pPr>
-            <w:r>
-              <w:rPr>
-                <w:sz w:val="28"/>
-                <w:szCs w:val="28"/>
-              </w:rPr>
-              <w:t xml:space="preserve">CHAPTER 7: CONCLUSION </w:t>
-            </w:r>
-          </w:p>
-        </w:tc>
-        <w:tc>
-          <w:tcPr>
-            <w:tcW w:w="1615" w:type="dxa"/>
-          </w:tcPr>
-          <w:p>
-            <w:pPr>
-              <w:jc w:val="right"/>
-              <w:rPr>
-                <w:sz w:val="28"/>
-                <w:szCs w:val="28"/>
-              </w:rPr>
-            </w:pPr>
-            <w:r>
-              <w:rPr>
-                <w:sz w:val="28"/>
-                <w:szCs w:val="28"/>
-              </w:rPr>
-              <w:t>30</w:t>
-            </w:r>
-          </w:p>
-        </w:tc>
-      </w:tr>
-      <w:tr>
-        <w:tc>
-          <w:tcPr>
-            <w:tcW w:w="7735" w:type="dxa"/>
-          </w:tcPr>
-          <w:p>
-            <w:pPr>
-              <w:rPr>
-                <w:sz w:val="28"/>
-                <w:szCs w:val="28"/>
-              </w:rPr>
-            </w:pPr>
-          </w:p>
-        </w:tc>
-        <w:tc>
-          <w:tcPr>
-            <w:tcW w:w="1615" w:type="dxa"/>
-          </w:tcPr>
-          <w:p>
-            <w:pPr>
-              <w:rPr>
-                <w:sz w:val="28"/>
-                <w:szCs w:val="28"/>
-              </w:rPr>
-            </w:pPr>
-          </w:p>
-        </w:tc>
-      </w:tr>
-      <w:tr>
-        <w:tc>
-          <w:tcPr>
-            <w:tcW w:w="7735" w:type="dxa"/>
-          </w:tcPr>
-          <w:p>
-            <w:pPr>
-              <w:rPr>
-                <w:sz w:val="28"/>
-                <w:szCs w:val="28"/>
-              </w:rPr>
-            </w:pPr>
-            <w:r>
-              <w:rPr>
-                <w:sz w:val="28"/>
-                <w:szCs w:val="28"/>
-              </w:rPr>
               <w:t>CHAPTER 8: REFRENCES</w:t>
             </w:r>
           </w:p>
@@ -2664,7 +2681,7 @@
                 <w:sz w:val="28"/>
                 <w:szCs w:val="28"/>
               </w:rPr>
-              <w:t>31</w:t>
+              <w:t>28</w:t>
             </w:r>
           </w:p>
         </w:tc>
@@ -2728,9 +2745,18 @@
     <w:p/>
     <w:p/>
     <w:p/>
-    <w:p/>
-    <w:p/>
-    <w:p/>
+    <w:p>
+      <w:pPr>
+        <w:sectPr>
+          <w:footerReference w:type="default" r:id="rId10"/>
+          <w:pgSz w:w="12240" w:h="15840"/>
+          <w:pgMar w:top="1440" w:right="1440" w:bottom="1440" w:left="1440" w:header="720" w:footer="720" w:gutter="0"/>
+          <w:pgNumType w:fmt="upperRoman" w:start="1"/>
+          <w:cols w:space="720"/>
+          <w:docGrid w:linePitch="360"/>
+        </w:sectPr>
+      </w:pPr>
+    </w:p>
     <w:p>
       <w:pPr>
         <w:jc w:val="center"/>
@@ -3373,21 +3399,12 @@
                 <w:szCs w:val="28"/>
               </w:rPr>
             </w:pPr>
-            <w:proofErr w:type="spellStart"/>
             <w:r>
               <w:rPr>
                 <w:sz w:val="28"/>
                 <w:szCs w:val="28"/>
               </w:rPr>
-              <w:t>Jupyter</w:t>
-            </w:r>
-            <w:proofErr w:type="spellEnd"/>
-            <w:r>
-              <w:rPr>
-                <w:sz w:val="28"/>
-                <w:szCs w:val="28"/>
-              </w:rPr>
-              <w:t xml:space="preserve"> Notebook</w:t>
+              <w:t>Jupyter Notebook</w:t>
             </w:r>
           </w:p>
         </w:tc>
@@ -3514,21 +3531,12 @@
                 <w:szCs w:val="28"/>
               </w:rPr>
             </w:pPr>
-            <w:proofErr w:type="spellStart"/>
             <w:r>
               <w:rPr>
                 <w:sz w:val="28"/>
                 <w:szCs w:val="28"/>
               </w:rPr>
-              <w:t>Supabase</w:t>
-            </w:r>
-            <w:proofErr w:type="spellEnd"/>
-            <w:r>
-              <w:rPr>
-                <w:sz w:val="28"/>
-                <w:szCs w:val="28"/>
-              </w:rPr>
-              <w:t xml:space="preserve"> Storage</w:t>
+              <w:t>Supabase Storage</w:t>
             </w:r>
           </w:p>
         </w:tc>
@@ -3567,21 +3575,12 @@
                 <w:szCs w:val="28"/>
               </w:rPr>
             </w:pPr>
-            <w:proofErr w:type="spellStart"/>
             <w:r>
               <w:rPr>
                 <w:sz w:val="28"/>
                 <w:szCs w:val="28"/>
               </w:rPr>
-              <w:t>Supabase</w:t>
-            </w:r>
-            <w:proofErr w:type="spellEnd"/>
-            <w:r>
-              <w:rPr>
-                <w:sz w:val="28"/>
-                <w:szCs w:val="28"/>
-              </w:rPr>
-              <w:t xml:space="preserve"> PostgreSQL</w:t>
+              <w:t>Supabase PostgreSQL</w:t>
             </w:r>
           </w:p>
         </w:tc>
@@ -3620,21 +3619,12 @@
                 <w:szCs w:val="28"/>
               </w:rPr>
             </w:pPr>
-            <w:proofErr w:type="spellStart"/>
             <w:r>
               <w:rPr>
                 <w:sz w:val="28"/>
                 <w:szCs w:val="28"/>
               </w:rPr>
-              <w:t>Supabase</w:t>
-            </w:r>
-            <w:proofErr w:type="spellEnd"/>
-            <w:r>
-              <w:rPr>
-                <w:sz w:val="28"/>
-                <w:szCs w:val="28"/>
-              </w:rPr>
-              <w:t xml:space="preserve"> Auth</w:t>
+              <w:t>Supabase Auth</w:t>
             </w:r>
           </w:p>
         </w:tc>
@@ -4242,7 +4232,7 @@
                     <pic:cNvPicPr/>
                   </pic:nvPicPr>
                   <pic:blipFill>
-                    <a:blip r:embed="rId10">
+                    <a:blip r:embed="rId11">
                       <a:extLst>
                         <a:ext uri="{28A0092B-C50C-407E-A947-70E740481C1C}">
                           <a14:useLocalDpi xmlns:a14="http://schemas.microsoft.com/office/drawing/2010/main" val="0"/>
@@ -4328,18 +4318,8 @@
           <w:sz w:val="32"/>
           <w:szCs w:val="32"/>
         </w:rPr>
-        <w:t xml:space="preserve">Model </w:t>
-      </w:r>
-      <w:proofErr w:type="spellStart"/>
-      <w:r>
-        <w:rPr>
-          <w:rFonts w:ascii="Times New Roman" w:hAnsi="Times New Roman" w:cs="Times New Roman"/>
-          <w:sz w:val="32"/>
-          <w:szCs w:val="32"/>
-        </w:rPr>
-        <w:t>Inforamtion</w:t>
-      </w:r>
-      <w:proofErr w:type="spellEnd"/>
+        <w:t>Model Inforamtion</w:t>
+      </w:r>
     </w:p>
     <w:p>
       <w:pPr>
@@ -4407,18 +4387,8 @@
           <w:sz w:val="28"/>
           <w:szCs w:val="28"/>
         </w:rPr>
-        <w:t>Framework: TensorFlow/</w:t>
-      </w:r>
-      <w:proofErr w:type="spellStart"/>
-      <w:r>
-        <w:rPr>
-          <w:rFonts w:ascii="Times New Roman" w:hAnsi="Times New Roman" w:cs="Times New Roman"/>
-          <w:sz w:val="28"/>
-          <w:szCs w:val="28"/>
-        </w:rPr>
-        <w:t>Keras</w:t>
-      </w:r>
-      <w:proofErr w:type="spellEnd"/>
+        <w:t>Framework: TensorFlow/Keras</w:t>
+      </w:r>
     </w:p>
     <w:p>
       <w:pPr>
@@ -4802,25 +4772,7 @@
           <w:sz w:val="28"/>
           <w:szCs w:val="28"/>
         </w:rPr>
-        <w:t xml:space="preserve">Vibration (mm/s) - </w:t>
-      </w:r>
-      <w:proofErr w:type="gramStart"/>
-      <w:r>
-        <w:rPr>
-          <w:rFonts w:ascii="Times New Roman" w:hAnsi="Times New Roman" w:cs="Times New Roman"/>
-          <w:sz w:val="28"/>
-          <w:szCs w:val="28"/>
-        </w:rPr>
-        <w:t>Multi-axis</w:t>
-      </w:r>
-      <w:proofErr w:type="gramEnd"/>
-      <w:r>
-        <w:rPr>
-          <w:rFonts w:ascii="Times New Roman" w:hAnsi="Times New Roman" w:cs="Times New Roman"/>
-          <w:sz w:val="28"/>
-          <w:szCs w:val="28"/>
-        </w:rPr>
-        <w:t xml:space="preserve"> vibration measurements</w:t>
+        <w:t>Vibration (mm/s) - Multi-axis vibration measurements</w:t>
       </w:r>
     </w:p>
     <w:p>
@@ -5056,25 +5008,7 @@
           <w:sz w:val="28"/>
           <w:szCs w:val="28"/>
         </w:rPr>
-        <w:t xml:space="preserve">Read CSV files from </w:t>
-      </w:r>
-      <w:proofErr w:type="spellStart"/>
-      <w:r>
-        <w:rPr>
-          <w:rFonts w:ascii="Times New Roman" w:hAnsi="Times New Roman" w:cs="Times New Roman"/>
-          <w:sz w:val="28"/>
-          <w:szCs w:val="28"/>
-        </w:rPr>
-        <w:t>Supabase</w:t>
-      </w:r>
-      <w:proofErr w:type="spellEnd"/>
-      <w:r>
-        <w:rPr>
-          <w:rFonts w:ascii="Times New Roman" w:hAnsi="Times New Roman" w:cs="Times New Roman"/>
-          <w:sz w:val="28"/>
-          <w:szCs w:val="28"/>
-        </w:rPr>
-        <w:t xml:space="preserve"> storage</w:t>
+        <w:t>Read CSV files from Supabase storage</w:t>
       </w:r>
     </w:p>
     <w:p>
@@ -5094,18 +5028,8 @@
           <w:sz w:val="28"/>
           <w:szCs w:val="28"/>
         </w:rPr>
-        <w:t xml:space="preserve">Merge multiple datasets by timestamp and </w:t>
-      </w:r>
-      <w:proofErr w:type="spellStart"/>
-      <w:r>
-        <w:rPr>
-          <w:rFonts w:ascii="Times New Roman" w:hAnsi="Times New Roman" w:cs="Times New Roman"/>
-          <w:sz w:val="28"/>
-          <w:szCs w:val="28"/>
-        </w:rPr>
-        <w:t>motor_id</w:t>
-      </w:r>
-      <w:proofErr w:type="spellEnd"/>
+        <w:t>Merge multiple datasets by timestamp and motor_id</w:t>
+      </w:r>
     </w:p>
     <w:p>
       <w:pPr>
@@ -5439,25 +5363,7 @@
           <w:sz w:val="28"/>
           <w:szCs w:val="28"/>
         </w:rPr>
-        <w:t xml:space="preserve">Sequence Length: </w:t>
-      </w:r>
-      <w:proofErr w:type="gramStart"/>
-      <w:r>
-        <w:rPr>
-          <w:rFonts w:ascii="Times New Roman" w:hAnsi="Times New Roman" w:cs="Times New Roman"/>
-          <w:sz w:val="28"/>
-          <w:szCs w:val="28"/>
-        </w:rPr>
-        <w:t>30 time</w:t>
-      </w:r>
-      <w:proofErr w:type="gramEnd"/>
-      <w:r>
-        <w:rPr>
-          <w:rFonts w:ascii="Times New Roman" w:hAnsi="Times New Roman" w:cs="Times New Roman"/>
-          <w:sz w:val="28"/>
-          <w:szCs w:val="28"/>
-        </w:rPr>
-        <w:t xml:space="preserve"> steps (30 minutes of data)</w:t>
+        <w:t>Sequence Length: 30 time steps (30 minutes of data)</w:t>
       </w:r>
     </w:p>
     <w:p>
@@ -5726,7 +5632,7 @@
                     <pic:cNvPicPr/>
                   </pic:nvPicPr>
                   <pic:blipFill>
-                    <a:blip r:embed="rId11">
+                    <a:blip r:embed="rId12">
                       <a:extLst>
                         <a:ext uri="{28A0092B-C50C-407E-A947-70E740481C1C}">
                           <a14:useLocalDpi xmlns:a14="http://schemas.microsoft.com/office/drawing/2010/main" val="0"/>
@@ -5829,18 +5735,8 @@
           <w:sz w:val="28"/>
           <w:szCs w:val="28"/>
         </w:rPr>
-        <w:t xml:space="preserve">Loss Function: Binary </w:t>
-      </w:r>
-      <w:proofErr w:type="spellStart"/>
-      <w:r>
-        <w:rPr>
-          <w:rFonts w:ascii="Times New Roman" w:hAnsi="Times New Roman" w:cs="Times New Roman"/>
-          <w:sz w:val="28"/>
-          <w:szCs w:val="28"/>
-        </w:rPr>
-        <w:t>Crossentropy</w:t>
-      </w:r>
-      <w:proofErr w:type="spellEnd"/>
+        <w:t>Loss Function: Binary Crossentropy</w:t>
+      </w:r>
     </w:p>
     <w:p>
       <w:pPr>
@@ -6287,25 +6183,7 @@
           <w:sz w:val="28"/>
           <w:szCs w:val="28"/>
         </w:rPr>
-        <w:t xml:space="preserve">Calculate binary </w:t>
-      </w:r>
-      <w:proofErr w:type="spellStart"/>
-      <w:r>
-        <w:rPr>
-          <w:rFonts w:ascii="Times New Roman" w:hAnsi="Times New Roman" w:cs="Times New Roman"/>
-          <w:sz w:val="28"/>
-          <w:szCs w:val="28"/>
-        </w:rPr>
-        <w:t>crossentropy</w:t>
-      </w:r>
-      <w:proofErr w:type="spellEnd"/>
-      <w:r>
-        <w:rPr>
-          <w:rFonts w:ascii="Times New Roman" w:hAnsi="Times New Roman" w:cs="Times New Roman"/>
-          <w:sz w:val="28"/>
-          <w:szCs w:val="28"/>
-        </w:rPr>
-        <w:t xml:space="preserve"> loss</w:t>
+        <w:t>Calculate binary crossentropy loss</w:t>
       </w:r>
     </w:p>
     <w:p>
@@ -7468,7 +7346,7 @@
                     <pic:cNvPicPr/>
                   </pic:nvPicPr>
                   <pic:blipFill>
-                    <a:blip r:embed="rId12">
+                    <a:blip r:embed="rId13">
                       <a:extLst>
                         <a:ext uri="{28A0092B-C50C-407E-A947-70E740481C1C}">
                           <a14:useLocalDpi xmlns:a14="http://schemas.microsoft.com/office/drawing/2010/main" val="0"/>
@@ -8616,25 +8494,7 @@
           <w:sz w:val="28"/>
           <w:szCs w:val="28"/>
         </w:rPr>
-        <w:t xml:space="preserve">Install required software (Python, VS Code, </w:t>
-      </w:r>
-      <w:proofErr w:type="spellStart"/>
-      <w:r>
-        <w:rPr>
-          <w:rFonts w:ascii="Times New Roman" w:hAnsi="Times New Roman" w:cs="Times New Roman"/>
-          <w:sz w:val="28"/>
-          <w:szCs w:val="28"/>
-        </w:rPr>
-        <w:t>Jupyter</w:t>
-      </w:r>
-      <w:proofErr w:type="spellEnd"/>
-      <w:r>
-        <w:rPr>
-          <w:rFonts w:ascii="Times New Roman" w:hAnsi="Times New Roman" w:cs="Times New Roman"/>
-          <w:sz w:val="28"/>
-          <w:szCs w:val="28"/>
-        </w:rPr>
-        <w:t>, Tableau)</w:t>
+        <w:t>Install required software (Python, VS Code, Jupyter, Tableau)</w:t>
       </w:r>
     </w:p>
     <w:p>
@@ -8762,25 +8622,7 @@
           <w:sz w:val="28"/>
           <w:szCs w:val="28"/>
         </w:rPr>
-        <w:t xml:space="preserve">Create and configure </w:t>
-      </w:r>
-      <w:proofErr w:type="spellStart"/>
-      <w:r>
-        <w:rPr>
-          <w:rFonts w:ascii="Times New Roman" w:hAnsi="Times New Roman" w:cs="Times New Roman"/>
-          <w:sz w:val="28"/>
-          <w:szCs w:val="28"/>
-        </w:rPr>
-        <w:t>Supabase</w:t>
-      </w:r>
-      <w:proofErr w:type="spellEnd"/>
-      <w:r>
-        <w:rPr>
-          <w:rFonts w:ascii="Times New Roman" w:hAnsi="Times New Roman" w:cs="Times New Roman"/>
-          <w:sz w:val="28"/>
-          <w:szCs w:val="28"/>
-        </w:rPr>
-        <w:t xml:space="preserve"> project</w:t>
+        <w:t>Create and configure Supabase project</w:t>
       </w:r>
     </w:p>
     <w:p>
@@ -8826,43 +8668,7 @@
           <w:sz w:val="28"/>
           <w:szCs w:val="28"/>
         </w:rPr>
-        <w:t>Design database tables (</w:t>
-      </w:r>
-      <w:proofErr w:type="spellStart"/>
-      <w:r>
-        <w:rPr>
-          <w:rFonts w:ascii="Times New Roman" w:hAnsi="Times New Roman" w:cs="Times New Roman"/>
-          <w:sz w:val="28"/>
-          <w:szCs w:val="28"/>
-        </w:rPr>
-        <w:t>login_logs</w:t>
-      </w:r>
-      <w:proofErr w:type="spellEnd"/>
-      <w:r>
-        <w:rPr>
-          <w:rFonts w:ascii="Times New Roman" w:hAnsi="Times New Roman" w:cs="Times New Roman"/>
-          <w:sz w:val="28"/>
-          <w:szCs w:val="28"/>
-        </w:rPr>
-        <w:t xml:space="preserve">, </w:t>
-      </w:r>
-      <w:proofErr w:type="spellStart"/>
-      <w:r>
-        <w:rPr>
-          <w:rFonts w:ascii="Times New Roman" w:hAnsi="Times New Roman" w:cs="Times New Roman"/>
-          <w:sz w:val="28"/>
-          <w:szCs w:val="28"/>
-        </w:rPr>
-        <w:t>model_predictions</w:t>
-      </w:r>
-      <w:proofErr w:type="spellEnd"/>
-      <w:r>
-        <w:rPr>
-          <w:rFonts w:ascii="Times New Roman" w:hAnsi="Times New Roman" w:cs="Times New Roman"/>
-          <w:sz w:val="28"/>
-          <w:szCs w:val="28"/>
-        </w:rPr>
-        <w:t>)</w:t>
+        <w:t>Design database tables (login_logs, model_predictions)</w:t>
       </w:r>
     </w:p>
     <w:p>
@@ -8944,25 +8750,7 @@
           <w:sz w:val="28"/>
           <w:szCs w:val="28"/>
         </w:rPr>
-        <w:t xml:space="preserve">Develop </w:t>
-      </w:r>
-      <w:proofErr w:type="spellStart"/>
-      <w:r>
-        <w:rPr>
-          <w:rFonts w:ascii="Times New Roman" w:hAnsi="Times New Roman" w:cs="Times New Roman"/>
-          <w:sz w:val="28"/>
-          <w:szCs w:val="28"/>
-        </w:rPr>
-        <w:t>Supabase</w:t>
-      </w:r>
-      <w:proofErr w:type="spellEnd"/>
-      <w:r>
-        <w:rPr>
-          <w:rFonts w:ascii="Times New Roman" w:hAnsi="Times New Roman" w:cs="Times New Roman"/>
-          <w:sz w:val="28"/>
-          <w:szCs w:val="28"/>
-        </w:rPr>
-        <w:t xml:space="preserve"> connection module</w:t>
+        <w:t>Develop Supabase connection module</w:t>
       </w:r>
     </w:p>
     <w:p>
@@ -9438,18 +9226,8 @@
           <w:sz w:val="28"/>
           <w:szCs w:val="28"/>
         </w:rPr>
-        <w:t xml:space="preserve">Implement authentication using </w:t>
-      </w:r>
-      <w:proofErr w:type="spellStart"/>
-      <w:r>
-        <w:rPr>
-          <w:rFonts w:ascii="Times New Roman" w:hAnsi="Times New Roman" w:cs="Times New Roman"/>
-          <w:sz w:val="28"/>
-          <w:szCs w:val="28"/>
-        </w:rPr>
-        <w:t>Supabase</w:t>
-      </w:r>
-      <w:proofErr w:type="spellEnd"/>
+        <w:t>Implement authentication using Supabase</w:t>
+      </w:r>
     </w:p>
     <w:p>
       <w:pPr>
@@ -9553,25 +9331,7 @@
           <w:sz w:val="28"/>
           <w:szCs w:val="28"/>
         </w:rPr>
-        <w:t xml:space="preserve">Store logs in </w:t>
-      </w:r>
-      <w:proofErr w:type="spellStart"/>
-      <w:r>
-        <w:rPr>
-          <w:rFonts w:ascii="Times New Roman" w:hAnsi="Times New Roman" w:cs="Times New Roman"/>
-          <w:sz w:val="28"/>
-          <w:szCs w:val="28"/>
-        </w:rPr>
-        <w:t>Supabase</w:t>
-      </w:r>
-      <w:proofErr w:type="spellEnd"/>
-      <w:r>
-        <w:rPr>
-          <w:rFonts w:ascii="Times New Roman" w:hAnsi="Times New Roman" w:cs="Times New Roman"/>
-          <w:sz w:val="28"/>
-          <w:szCs w:val="28"/>
-        </w:rPr>
-        <w:t xml:space="preserve"> database</w:t>
+        <w:t>Store logs in Supabase database</w:t>
       </w:r>
     </w:p>
     <w:p>
@@ -9826,7 +9586,7 @@
                     <pic:cNvPicPr/>
                   </pic:nvPicPr>
                   <pic:blipFill>
-                    <a:blip r:embed="rId13" cstate="print">
+                    <a:blip r:embed="rId14" cstate="print">
                       <a:extLst>
                         <a:ext uri="{28A0092B-C50C-407E-A947-70E740481C1C}">
                           <a14:useLocalDpi xmlns:a14="http://schemas.microsoft.com/office/drawing/2010/main" val="0"/>
@@ -10130,16 +9890,7 @@
           <w:sz w:val="28"/>
           <w:szCs w:val="28"/>
         </w:rPr>
-        <w:t xml:space="preserve"> like Pandas, </w:t>
-      </w:r>
-      <w:proofErr w:type="gramStart"/>
-      <w:r>
-        <w:rPr>
-          <w:rFonts w:ascii="Times New Roman" w:hAnsi="Times New Roman" w:cs="Times New Roman"/>
-          <w:sz w:val="28"/>
-          <w:szCs w:val="28"/>
-        </w:rPr>
-        <w:t xml:space="preserve">NumPy </w:t>
+        <w:t xml:space="preserve"> like Pandas, NumPy </w:t>
       </w:r>
       <w:r>
         <w:rPr>
@@ -10155,52 +9906,7 @@
           <w:sz w:val="28"/>
           <w:szCs w:val="28"/>
         </w:rPr>
-        <w:t>TensorFlow</w:t>
-      </w:r>
-      <w:proofErr w:type="gramEnd"/>
-      <w:r>
-        <w:rPr>
-          <w:rFonts w:ascii="Times New Roman" w:hAnsi="Times New Roman" w:cs="Times New Roman"/>
-          <w:sz w:val="28"/>
-          <w:szCs w:val="28"/>
-        </w:rPr>
-        <w:t>/</w:t>
-      </w:r>
-      <w:proofErr w:type="spellStart"/>
-      <w:r>
-        <w:rPr>
-          <w:rFonts w:ascii="Times New Roman" w:hAnsi="Times New Roman" w:cs="Times New Roman"/>
-          <w:sz w:val="28"/>
-          <w:szCs w:val="28"/>
-        </w:rPr>
-        <w:t>Keras</w:t>
-      </w:r>
-      <w:proofErr w:type="spellEnd"/>
-      <w:r>
-        <w:rPr>
-          <w:rFonts w:ascii="Times New Roman" w:hAnsi="Times New Roman" w:cs="Times New Roman"/>
-          <w:sz w:val="28"/>
-          <w:szCs w:val="28"/>
-        </w:rPr>
-        <w:t xml:space="preserve">, </w:t>
-      </w:r>
-      <w:proofErr w:type="spellStart"/>
-      <w:r>
-        <w:rPr>
-          <w:rFonts w:ascii="Times New Roman" w:hAnsi="Times New Roman" w:cs="Times New Roman"/>
-          <w:sz w:val="28"/>
-          <w:szCs w:val="28"/>
-        </w:rPr>
-        <w:t>Supabase</w:t>
-      </w:r>
-      <w:proofErr w:type="spellEnd"/>
-      <w:r>
-        <w:rPr>
-          <w:rFonts w:ascii="Times New Roman" w:hAnsi="Times New Roman" w:cs="Times New Roman"/>
-          <w:sz w:val="28"/>
-          <w:szCs w:val="28"/>
-        </w:rPr>
-        <w:t xml:space="preserve"> client, Flask, Scikit-learn</w:t>
+        <w:t>TensorFlow/Keras, Supabase client, Flask, Scikit-learn</w:t>
       </w:r>
     </w:p>
     <w:p>
@@ -10255,25 +9961,7 @@
           <w:sz w:val="28"/>
           <w:szCs w:val="28"/>
         </w:rPr>
-        <w:t xml:space="preserve">- SUPABASE_URL: Your </w:t>
-      </w:r>
-      <w:proofErr w:type="spellStart"/>
-      <w:r>
-        <w:rPr>
-          <w:rFonts w:ascii="Times New Roman" w:hAnsi="Times New Roman" w:cs="Times New Roman"/>
-          <w:sz w:val="28"/>
-          <w:szCs w:val="28"/>
-        </w:rPr>
-        <w:t>Supabase</w:t>
-      </w:r>
-      <w:proofErr w:type="spellEnd"/>
-      <w:r>
-        <w:rPr>
-          <w:rFonts w:ascii="Times New Roman" w:hAnsi="Times New Roman" w:cs="Times New Roman"/>
-          <w:sz w:val="28"/>
-          <w:szCs w:val="28"/>
-        </w:rPr>
-        <w:t xml:space="preserve"> project URL</w:t>
+        <w:t>- SUPABASE_URL: Your Supabase project URL</w:t>
       </w:r>
     </w:p>
     <w:p>
@@ -10293,25 +9981,7 @@
           <w:sz w:val="28"/>
           <w:szCs w:val="28"/>
         </w:rPr>
-        <w:t xml:space="preserve">- SUPABASE_KEY: Your </w:t>
-      </w:r>
-      <w:proofErr w:type="spellStart"/>
-      <w:r>
-        <w:rPr>
-          <w:rFonts w:ascii="Times New Roman" w:hAnsi="Times New Roman" w:cs="Times New Roman"/>
-          <w:sz w:val="28"/>
-          <w:szCs w:val="28"/>
-        </w:rPr>
-        <w:t>Supabase</w:t>
-      </w:r>
-      <w:proofErr w:type="spellEnd"/>
-      <w:r>
-        <w:rPr>
-          <w:rFonts w:ascii="Times New Roman" w:hAnsi="Times New Roman" w:cs="Times New Roman"/>
-          <w:sz w:val="28"/>
-          <w:szCs w:val="28"/>
-        </w:rPr>
-        <w:t xml:space="preserve"> anon/service key</w:t>
+        <w:t>- SUPABASE_KEY: Your Supabase anon/service key</w:t>
       </w:r>
     </w:p>
     <w:p>
@@ -10386,25 +10056,7 @@
           <w:sz w:val="28"/>
           <w:szCs w:val="28"/>
         </w:rPr>
-        <w:t xml:space="preserve">Action: Create </w:t>
-      </w:r>
-      <w:proofErr w:type="spellStart"/>
-      <w:r>
-        <w:rPr>
-          <w:rFonts w:ascii="Times New Roman" w:hAnsi="Times New Roman" w:cs="Times New Roman"/>
-          <w:sz w:val="28"/>
-          <w:szCs w:val="28"/>
-        </w:rPr>
-        <w:t>Supabase</w:t>
-      </w:r>
-      <w:proofErr w:type="spellEnd"/>
-      <w:r>
-        <w:rPr>
-          <w:rFonts w:ascii="Times New Roman" w:hAnsi="Times New Roman" w:cs="Times New Roman"/>
-          <w:sz w:val="28"/>
-          <w:szCs w:val="28"/>
-        </w:rPr>
-        <w:t xml:space="preserve"> database tables using provided SQL scripts</w:t>
+        <w:t>Action: Create Supabase database tables using provided SQL scripts</w:t>
       </w:r>
     </w:p>
     <w:p>
@@ -10444,141 +10096,15 @@
           <w:sz w:val="28"/>
           <w:szCs w:val="28"/>
         </w:rPr>
-        <w:t xml:space="preserve">a) </w:t>
-      </w:r>
-      <w:proofErr w:type="spellStart"/>
-      <w:r>
-        <w:rPr>
-          <w:rFonts w:ascii="Times New Roman" w:hAnsi="Times New Roman" w:cs="Times New Roman"/>
-          <w:sz w:val="28"/>
-          <w:szCs w:val="28"/>
-        </w:rPr>
-        <w:t>login_logs</w:t>
-      </w:r>
-      <w:proofErr w:type="spellEnd"/>
-      <w:r>
-        <w:rPr>
-          <w:rFonts w:ascii="Times New Roman" w:hAnsi="Times New Roman" w:cs="Times New Roman"/>
-          <w:sz w:val="28"/>
-          <w:szCs w:val="28"/>
-        </w:rPr>
-        <w:t xml:space="preserve"> table:</w:t>
-      </w:r>
-      <w:r>
-        <w:rPr>
-          <w:rFonts w:ascii="Times New Roman" w:hAnsi="Times New Roman" w:cs="Times New Roman"/>
-          <w:sz w:val="28"/>
-          <w:szCs w:val="28"/>
-        </w:rPr>
-        <w:t xml:space="preserve"> id (</w:t>
-      </w:r>
-      <w:proofErr w:type="spellStart"/>
-      <w:r>
-        <w:rPr>
-          <w:rFonts w:ascii="Times New Roman" w:hAnsi="Times New Roman" w:cs="Times New Roman"/>
-          <w:sz w:val="28"/>
-          <w:szCs w:val="28"/>
-        </w:rPr>
-        <w:t>uuid</w:t>
-      </w:r>
-      <w:proofErr w:type="spellEnd"/>
-      <w:r>
-        <w:rPr>
-          <w:rFonts w:ascii="Times New Roman" w:hAnsi="Times New Roman" w:cs="Times New Roman"/>
-          <w:sz w:val="28"/>
-          <w:szCs w:val="28"/>
-        </w:rPr>
-        <w:t xml:space="preserve">, primary key), </w:t>
-      </w:r>
-      <w:proofErr w:type="spellStart"/>
-      <w:r>
-        <w:rPr>
-          <w:rFonts w:ascii="Times New Roman" w:hAnsi="Times New Roman" w:cs="Times New Roman"/>
-          <w:sz w:val="28"/>
-          <w:szCs w:val="28"/>
-        </w:rPr>
-        <w:t>user_email</w:t>
-      </w:r>
-      <w:proofErr w:type="spellEnd"/>
-      <w:r>
-        <w:rPr>
-          <w:rFonts w:ascii="Times New Roman" w:hAnsi="Times New Roman" w:cs="Times New Roman"/>
-          <w:sz w:val="28"/>
-          <w:szCs w:val="28"/>
-        </w:rPr>
-        <w:t xml:space="preserve"> (text</w:t>
-      </w:r>
-      <w:proofErr w:type="gramStart"/>
-      <w:r>
-        <w:rPr>
-          <w:rFonts w:ascii="Times New Roman" w:hAnsi="Times New Roman" w:cs="Times New Roman"/>
-          <w:sz w:val="28"/>
-          <w:szCs w:val="28"/>
-        </w:rPr>
-        <w:t>),</w:t>
-      </w:r>
-      <w:proofErr w:type="spellStart"/>
-      <w:r>
-        <w:rPr>
-          <w:rFonts w:ascii="Times New Roman" w:hAnsi="Times New Roman" w:cs="Times New Roman"/>
-          <w:sz w:val="28"/>
-          <w:szCs w:val="28"/>
-        </w:rPr>
-        <w:t>login</w:t>
-      </w:r>
-      <w:proofErr w:type="gramEnd"/>
-      <w:r>
-        <w:rPr>
-          <w:rFonts w:ascii="Times New Roman" w:hAnsi="Times New Roman" w:cs="Times New Roman"/>
-          <w:sz w:val="28"/>
-          <w:szCs w:val="28"/>
-        </w:rPr>
-        <w:t>_time</w:t>
-      </w:r>
-      <w:proofErr w:type="spellEnd"/>
-      <w:r>
-        <w:rPr>
-          <w:rFonts w:ascii="Times New Roman" w:hAnsi="Times New Roman" w:cs="Times New Roman"/>
-          <w:sz w:val="28"/>
-          <w:szCs w:val="28"/>
-        </w:rPr>
-        <w:t xml:space="preserve"> (timestamp), </w:t>
-      </w:r>
-      <w:proofErr w:type="spellStart"/>
-      <w:r>
-        <w:rPr>
-          <w:rFonts w:ascii="Times New Roman" w:hAnsi="Times New Roman" w:cs="Times New Roman"/>
-          <w:sz w:val="28"/>
-          <w:szCs w:val="28"/>
-        </w:rPr>
-        <w:t>ip_address</w:t>
-      </w:r>
-      <w:proofErr w:type="spellEnd"/>
-      <w:r>
-        <w:rPr>
-          <w:rFonts w:ascii="Times New Roman" w:hAnsi="Times New Roman" w:cs="Times New Roman"/>
-          <w:sz w:val="28"/>
-          <w:szCs w:val="28"/>
-        </w:rPr>
-        <w:t xml:space="preserve"> (text), </w:t>
-      </w:r>
-      <w:proofErr w:type="spellStart"/>
-      <w:r>
-        <w:rPr>
-          <w:rFonts w:ascii="Times New Roman" w:hAnsi="Times New Roman" w:cs="Times New Roman"/>
-          <w:sz w:val="28"/>
-          <w:szCs w:val="28"/>
-        </w:rPr>
-        <w:t>dashboard_accessed</w:t>
-      </w:r>
-      <w:proofErr w:type="spellEnd"/>
-      <w:r>
-        <w:rPr>
-          <w:rFonts w:ascii="Times New Roman" w:hAnsi="Times New Roman" w:cs="Times New Roman"/>
-          <w:sz w:val="28"/>
-          <w:szCs w:val="28"/>
-        </w:rPr>
-        <w:t xml:space="preserve"> (text)   </w:t>
+        <w:t>a) login_logs table:</w:t>
+      </w:r>
+      <w:r>
+        <w:rPr>
+          <w:rFonts w:ascii="Times New Roman" w:hAnsi="Times New Roman" w:cs="Times New Roman"/>
+          <w:sz w:val="28"/>
+          <w:szCs w:val="28"/>
+        </w:rPr>
+        <w:t xml:space="preserve"> id (uuid, primary key), user_email (text),login_time (timestamp), ip_address (text), dashboard_accessed (text)   </w:t>
       </w:r>
     </w:p>
     <w:p>
@@ -10610,69 +10136,15 @@
           <w:sz w:val="28"/>
           <w:szCs w:val="28"/>
         </w:rPr>
-        <w:t xml:space="preserve">b) </w:t>
-      </w:r>
-      <w:proofErr w:type="spellStart"/>
-      <w:r>
-        <w:rPr>
-          <w:rFonts w:ascii="Times New Roman" w:hAnsi="Times New Roman" w:cs="Times New Roman"/>
-          <w:sz w:val="28"/>
-          <w:szCs w:val="28"/>
-        </w:rPr>
-        <w:t>model_predictions</w:t>
-      </w:r>
-      <w:proofErr w:type="spellEnd"/>
-      <w:r>
-        <w:rPr>
-          <w:rFonts w:ascii="Times New Roman" w:hAnsi="Times New Roman" w:cs="Times New Roman"/>
-          <w:sz w:val="28"/>
-          <w:szCs w:val="28"/>
-        </w:rPr>
-        <w:t xml:space="preserve"> table:</w:t>
-      </w:r>
-      <w:r>
-        <w:rPr>
-          <w:rFonts w:ascii="Times New Roman" w:hAnsi="Times New Roman" w:cs="Times New Roman"/>
-          <w:sz w:val="28"/>
-          <w:szCs w:val="28"/>
-        </w:rPr>
-        <w:t xml:space="preserve"> timestamp (timestamp), </w:t>
-      </w:r>
-      <w:proofErr w:type="spellStart"/>
-      <w:r>
-        <w:rPr>
-          <w:rFonts w:ascii="Times New Roman" w:hAnsi="Times New Roman" w:cs="Times New Roman"/>
-          <w:sz w:val="28"/>
-          <w:szCs w:val="28"/>
-        </w:rPr>
-        <w:t>motor_id</w:t>
-      </w:r>
-      <w:proofErr w:type="spellEnd"/>
-      <w:r>
-        <w:rPr>
-          <w:rFonts w:ascii="Times New Roman" w:hAnsi="Times New Roman" w:cs="Times New Roman"/>
-          <w:sz w:val="28"/>
-          <w:szCs w:val="28"/>
-        </w:rPr>
-        <w:t xml:space="preserve"> (text), </w:t>
-      </w:r>
-      <w:proofErr w:type="spellStart"/>
-      <w:r>
-        <w:rPr>
-          <w:rFonts w:ascii="Times New Roman" w:hAnsi="Times New Roman" w:cs="Times New Roman"/>
-          <w:sz w:val="28"/>
-          <w:szCs w:val="28"/>
-        </w:rPr>
-        <w:t>failure_probability</w:t>
-      </w:r>
-      <w:proofErr w:type="spellEnd"/>
-      <w:r>
-        <w:rPr>
-          <w:rFonts w:ascii="Times New Roman" w:hAnsi="Times New Roman" w:cs="Times New Roman"/>
-          <w:sz w:val="28"/>
-          <w:szCs w:val="28"/>
-        </w:rPr>
-        <w:t xml:space="preserve"> (float)</w:t>
+        <w:t>b) model_predictions table:</w:t>
+      </w:r>
+      <w:r>
+        <w:rPr>
+          <w:rFonts w:ascii="Times New Roman" w:hAnsi="Times New Roman" w:cs="Times New Roman"/>
+          <w:sz w:val="28"/>
+          <w:szCs w:val="28"/>
+        </w:rPr>
+        <w:t xml:space="preserve"> timestamp (timestamp), motor_id (text), failure_probability (float)</w:t>
       </w:r>
     </w:p>
     <w:p>
@@ -10715,25 +10187,7 @@
           <w:sz w:val="28"/>
           <w:szCs w:val="28"/>
         </w:rPr>
-        <w:t xml:space="preserve">Purpose: Download motor sensor data from </w:t>
-      </w:r>
-      <w:proofErr w:type="spellStart"/>
-      <w:r>
-        <w:rPr>
-          <w:rFonts w:ascii="Times New Roman" w:hAnsi="Times New Roman" w:cs="Times New Roman"/>
-          <w:sz w:val="28"/>
-          <w:szCs w:val="28"/>
-        </w:rPr>
-        <w:t>Supabase</w:t>
-      </w:r>
-      <w:proofErr w:type="spellEnd"/>
-      <w:r>
-        <w:rPr>
-          <w:rFonts w:ascii="Times New Roman" w:hAnsi="Times New Roman" w:cs="Times New Roman"/>
-          <w:sz w:val="28"/>
-          <w:szCs w:val="28"/>
-        </w:rPr>
-        <w:t xml:space="preserve"> storage</w:t>
+        <w:t>Purpose: Download motor sensor data from Supabase storage</w:t>
       </w:r>
     </w:p>
     <w:p>
@@ -10768,25 +10222,7 @@
           <w:sz w:val="28"/>
           <w:szCs w:val="28"/>
         </w:rPr>
-        <w:t xml:space="preserve">Step 5: Execute </w:t>
-      </w:r>
-      <w:proofErr w:type="spellStart"/>
-      <w:r>
-        <w:rPr>
-          <w:rFonts w:ascii="Times New Roman" w:hAnsi="Times New Roman" w:cs="Times New Roman"/>
-          <w:sz w:val="28"/>
-          <w:szCs w:val="28"/>
-        </w:rPr>
-        <w:t>Jupyter</w:t>
-      </w:r>
-      <w:proofErr w:type="spellEnd"/>
-      <w:r>
-        <w:rPr>
-          <w:rFonts w:ascii="Times New Roman" w:hAnsi="Times New Roman" w:cs="Times New Roman"/>
-          <w:sz w:val="28"/>
-          <w:szCs w:val="28"/>
-        </w:rPr>
-        <w:t xml:space="preserve"> Notebooks in Sequence</w:t>
+        <w:t>Step 5: Execute Jupyter Notebooks in Sequence</w:t>
       </w:r>
     </w:p>
     <w:p>
@@ -10906,18 +10342,8 @@
           <w:sz w:val="28"/>
           <w:szCs w:val="28"/>
         </w:rPr>
-        <w:t xml:space="preserve">- Output: Unified </w:t>
-      </w:r>
-      <w:proofErr w:type="spellStart"/>
-      <w:r>
-        <w:rPr>
-          <w:rFonts w:ascii="Times New Roman" w:hAnsi="Times New Roman" w:cs="Times New Roman"/>
-          <w:sz w:val="28"/>
-          <w:szCs w:val="28"/>
-        </w:rPr>
-        <w:t>DataFrame</w:t>
-      </w:r>
-      <w:proofErr w:type="spellEnd"/>
+        <w:t>- Output: Unified DataFrame</w:t>
+      </w:r>
     </w:p>
     <w:p>
       <w:pPr>
@@ -11679,25 +11105,7 @@
           <w:sz w:val="28"/>
           <w:szCs w:val="28"/>
         </w:rPr>
-        <w:t xml:space="preserve">- Logs entry to </w:t>
-      </w:r>
-      <w:proofErr w:type="spellStart"/>
-      <w:r>
-        <w:rPr>
-          <w:rFonts w:ascii="Times New Roman" w:hAnsi="Times New Roman" w:cs="Times New Roman"/>
-          <w:sz w:val="28"/>
-          <w:szCs w:val="28"/>
-        </w:rPr>
-        <w:t>login_logs</w:t>
-      </w:r>
-      <w:proofErr w:type="spellEnd"/>
-      <w:r>
-        <w:rPr>
-          <w:rFonts w:ascii="Times New Roman" w:hAnsi="Times New Roman" w:cs="Times New Roman"/>
-          <w:sz w:val="28"/>
-          <w:szCs w:val="28"/>
-        </w:rPr>
-        <w:t xml:space="preserve"> table</w:t>
+        <w:t>- Logs entry to login_logs table</w:t>
       </w:r>
     </w:p>
     <w:p>
@@ -11800,27 +11208,7 @@
           <w:szCs w:val="28"/>
           <w:lang w:bidi="en-US"/>
         </w:rPr>
-        <w:t xml:space="preserve">- Check </w:t>
-      </w:r>
-      <w:proofErr w:type="spellStart"/>
-      <w:r>
-        <w:rPr>
-          <w:rFonts w:ascii="Times New Roman" w:hAnsi="Times New Roman" w:cs="Times New Roman"/>
-          <w:sz w:val="28"/>
-          <w:szCs w:val="28"/>
-          <w:lang w:bidi="en-US"/>
-        </w:rPr>
-        <w:t>login_logs</w:t>
-      </w:r>
-      <w:proofErr w:type="spellEnd"/>
-      <w:r>
-        <w:rPr>
-          <w:rFonts w:ascii="Times New Roman" w:hAnsi="Times New Roman" w:cs="Times New Roman"/>
-          <w:sz w:val="28"/>
-          <w:szCs w:val="28"/>
-          <w:lang w:bidi="en-US"/>
-        </w:rPr>
-        <w:t xml:space="preserve"> table for user activity</w:t>
+        <w:t>- Check login_logs table for user activity</w:t>
       </w:r>
     </w:p>
     <w:p>
@@ -11980,18 +11368,8 @@
           <w:sz w:val="28"/>
           <w:szCs w:val="28"/>
         </w:rPr>
-        <w:t xml:space="preserve">Risk 3: API Rate Limits or Connectivity Issues with </w:t>
-      </w:r>
-      <w:proofErr w:type="spellStart"/>
-      <w:r>
-        <w:rPr>
-          <w:rFonts w:ascii="Times New Roman" w:hAnsi="Times New Roman" w:cs="Times New Roman"/>
-          <w:sz w:val="28"/>
-          <w:szCs w:val="28"/>
-        </w:rPr>
-        <w:t>Supabase</w:t>
-      </w:r>
-      <w:proofErr w:type="spellEnd"/>
+        <w:t>Risk 3: API Rate Limits or Connectivity Issues with Supabase</w:t>
+      </w:r>
     </w:p>
     <w:p>
       <w:pPr>
@@ -12698,27 +12076,7 @@
           <w:szCs w:val="28"/>
           <w:lang w:bidi="en-US"/>
         </w:rPr>
-        <w:t xml:space="preserve">Target: &lt; 5 </w:t>
-      </w:r>
-      <w:proofErr w:type="gramStart"/>
-      <w:r>
-        <w:rPr>
-          <w:rFonts w:ascii="Times New Roman" w:hAnsi="Times New Roman" w:cs="Times New Roman"/>
-          <w:sz w:val="28"/>
-          <w:szCs w:val="28"/>
-          <w:lang w:bidi="en-US"/>
-        </w:rPr>
-        <w:t>seconds</w:t>
-      </w:r>
-      <w:proofErr w:type="gramEnd"/>
-      <w:r>
-        <w:rPr>
-          <w:rFonts w:ascii="Times New Roman" w:hAnsi="Times New Roman" w:cs="Times New Roman"/>
-          <w:sz w:val="28"/>
-          <w:szCs w:val="28"/>
-          <w:lang w:bidi="en-US"/>
-        </w:rPr>
-        <w:t xml:space="preserve"> initial load</w:t>
+        <w:t>Target: &lt; 5 seconds initial load</w:t>
       </w:r>
     </w:p>
     <w:p>
@@ -12847,23 +12205,13 @@
         </w:rPr>
         <w:t xml:space="preserve">6.3.3 </w:t>
       </w:r>
-      <w:proofErr w:type="spellStart"/>
-      <w:r>
-        <w:rPr>
-          <w:rFonts w:ascii="Times New Roman" w:hAnsi="Times New Roman" w:cs="Times New Roman"/>
-          <w:sz w:val="32"/>
-          <w:szCs w:val="32"/>
-        </w:rPr>
-        <w:t>Buisness</w:t>
-      </w:r>
-      <w:proofErr w:type="spellEnd"/>
-      <w:r>
-        <w:rPr>
-          <w:rFonts w:ascii="Times New Roman" w:hAnsi="Times New Roman" w:cs="Times New Roman"/>
-          <w:sz w:val="32"/>
-          <w:szCs w:val="32"/>
-        </w:rPr>
-        <w:t xml:space="preserve"> metrices</w:t>
+      <w:r>
+        <w:rPr>
+          <w:rFonts w:ascii="Times New Roman" w:hAnsi="Times New Roman" w:cs="Times New Roman"/>
+          <w:sz w:val="32"/>
+          <w:szCs w:val="32"/>
+        </w:rPr>
+        <w:t>Buisness metrices</w:t>
       </w:r>
     </w:p>
     <w:p>
@@ -13298,7 +12646,7 @@
                     <pic:cNvPicPr/>
                   </pic:nvPicPr>
                   <pic:blipFill>
-                    <a:blip r:embed="rId14"/>
+                    <a:blip r:embed="rId15"/>
                     <a:stretch>
                       <a:fillRect/>
                     </a:stretch>
@@ -13352,7 +12700,7 @@
                     <pic:cNvPicPr/>
                   </pic:nvPicPr>
                   <pic:blipFill>
-                    <a:blip r:embed="rId15"/>
+                    <a:blip r:embed="rId16"/>
                     <a:stretch>
                       <a:fillRect/>
                     </a:stretch>
@@ -13405,7 +12753,7 @@
                     <pic:cNvPicPr/>
                   </pic:nvPicPr>
                   <pic:blipFill>
-                    <a:blip r:embed="rId16"/>
+                    <a:blip r:embed="rId17"/>
                     <a:stretch>
                       <a:fillRect/>
                     </a:stretch>
@@ -13459,7 +12807,7 @@
                     <pic:cNvPicPr/>
                   </pic:nvPicPr>
                   <pic:blipFill>
-                    <a:blip r:embed="rId17"/>
+                    <a:blip r:embed="rId18"/>
                     <a:stretch>
                       <a:fillRect/>
                     </a:stretch>
@@ -13512,7 +12860,7 @@
                     <pic:cNvPicPr/>
                   </pic:nvPicPr>
                   <pic:blipFill>
-                    <a:blip r:embed="rId18"/>
+                    <a:blip r:embed="rId19"/>
                     <a:stretch>
                       <a:fillRect/>
                     </a:stretch>
@@ -13566,7 +12914,7 @@
                     <pic:cNvPicPr/>
                   </pic:nvPicPr>
                   <pic:blipFill>
-                    <a:blip r:embed="rId19"/>
+                    <a:blip r:embed="rId20"/>
                     <a:stretch>
                       <a:fillRect/>
                     </a:stretch>
@@ -13619,7 +12967,7 @@
                     <pic:cNvPicPr/>
                   </pic:nvPicPr>
                   <pic:blipFill>
-                    <a:blip r:embed="rId20"/>
+                    <a:blip r:embed="rId21"/>
                     <a:stretch>
                       <a:fillRect/>
                     </a:stretch>
@@ -13672,7 +13020,7 @@
                     <pic:cNvPicPr/>
                   </pic:nvPicPr>
                   <pic:blipFill>
-                    <a:blip r:embed="rId21"/>
+                    <a:blip r:embed="rId22"/>
                     <a:stretch>
                       <a:fillRect/>
                     </a:stretch>
@@ -13726,7 +13074,7 @@
                     <pic:cNvPicPr/>
                   </pic:nvPicPr>
                   <pic:blipFill>
-                    <a:blip r:embed="rId22"/>
+                    <a:blip r:embed="rId23"/>
                     <a:stretch>
                       <a:fillRect/>
                     </a:stretch>
@@ -13819,25 +13167,7 @@
           <w:sz w:val="28"/>
           <w:szCs w:val="28"/>
         </w:rPr>
-        <w:t xml:space="preserve">The backend of the system is developed using the Flask framework. It initializes the application, enables CORS for frontend-backend communication, and loads environment variables securely using the </w:t>
-      </w:r>
-      <w:proofErr w:type="spellStart"/>
-      <w:r>
-        <w:rPr>
-          <w:rFonts w:ascii="Times New Roman" w:hAnsi="Times New Roman" w:cs="Times New Roman"/>
-          <w:sz w:val="28"/>
-          <w:szCs w:val="28"/>
-        </w:rPr>
-        <w:t>dotenv</w:t>
-      </w:r>
-      <w:proofErr w:type="spellEnd"/>
-      <w:r>
-        <w:rPr>
-          <w:rFonts w:ascii="Times New Roman" w:hAnsi="Times New Roman" w:cs="Times New Roman"/>
-          <w:sz w:val="28"/>
-          <w:szCs w:val="28"/>
-        </w:rPr>
-        <w:t xml:space="preserve"> library. The application provides a root route that serves the login page and a /login API endpoint that handles user authentication through POST requests. User credentials are validated using a custom authentication service, and login activities are recorded along with the user’s IP address. The backend dynamically reads configuration settings such as port number and debug mode from environment variables to maintain flexibility and security.</w:t>
+        <w:t>The backend of the system is developed using the Flask framework. It initializes the application, enables CORS for frontend-backend communication, and loads environment variables securely using the dotenv library. The application provides a root route that serves the login page and a /login API endpoint that handles user authentication through POST requests. User credentials are validated using a custom authentication service, and login activities are recorded along with the user’s IP address. The backend dynamically reads configuration settings such as port number and debug mode from environment variables to maintain flexibility and security.</w:t>
       </w:r>
     </w:p>
     <w:p>
@@ -13939,25 +13269,7 @@
           <w:sz w:val="28"/>
           <w:szCs w:val="28"/>
         </w:rPr>
-        <w:t xml:space="preserve">The authentication service manages user verification and login logging. Admin credentials are securely retrieved from environment variables. Upon successful authentication, user details including role information are returned. All login attempts (success or failure) are logged into a </w:t>
-      </w:r>
-      <w:proofErr w:type="spellStart"/>
-      <w:r>
-        <w:rPr>
-          <w:rFonts w:ascii="Times New Roman" w:hAnsi="Times New Roman" w:cs="Times New Roman"/>
-          <w:sz w:val="28"/>
-          <w:szCs w:val="28"/>
-        </w:rPr>
-        <w:t>Supabase</w:t>
-      </w:r>
-      <w:proofErr w:type="spellEnd"/>
-      <w:r>
-        <w:rPr>
-          <w:rFonts w:ascii="Times New Roman" w:hAnsi="Times New Roman" w:cs="Times New Roman"/>
-          <w:sz w:val="28"/>
-          <w:szCs w:val="28"/>
-        </w:rPr>
-        <w:t xml:space="preserve"> database table. The logging mechanism captures user email, IP address, login status, and timestamp. This ensures proper monitoring, traceability, and audit control within the system.</w:t>
+        <w:t>The authentication service manages user verification and login logging. Admin credentials are securely retrieved from environment variables. Upon successful authentication, user details including role information are returned. All login attempts (success or failure) are logged into a Supabase database table. The logging mechanism captures user email, IP address, login status, and timestamp. This ensures proper monitoring, traceability, and audit control within the system.</w:t>
       </w:r>
     </w:p>
     <w:p>
@@ -14117,25 +13429,7 @@
           <w:sz w:val="28"/>
           <w:szCs w:val="28"/>
         </w:rPr>
-        <w:t xml:space="preserve">In this stage, the raw data is cleaned and normalized. Missing values are removed, and sensor-related numerical columns are standardized using </w:t>
-      </w:r>
-      <w:proofErr w:type="spellStart"/>
-      <w:r>
-        <w:rPr>
-          <w:rFonts w:ascii="Times New Roman" w:hAnsi="Times New Roman" w:cs="Times New Roman"/>
-          <w:sz w:val="28"/>
-          <w:szCs w:val="28"/>
-        </w:rPr>
-        <w:t>StandardScaler</w:t>
-      </w:r>
-      <w:proofErr w:type="spellEnd"/>
-      <w:r>
-        <w:rPr>
-          <w:rFonts w:ascii="Times New Roman" w:hAnsi="Times New Roman" w:cs="Times New Roman"/>
-          <w:sz w:val="28"/>
-          <w:szCs w:val="28"/>
-        </w:rPr>
-        <w:t xml:space="preserve"> from Scikit-learn. The cleaned dataset is then saved into a processed data directory. This ensures consistent scaling and improves model performance during training.</w:t>
+        <w:t>In this stage, the raw data is cleaned and normalized. Missing values are removed, and sensor-related numerical columns are standardized using StandardScaler from Scikit-learn. The cleaned dataset is then saved into a processed data directory. This ensures consistent scaling and improves model performance during training.</w:t>
       </w:r>
     </w:p>
     <w:p>
@@ -14307,25 +13601,7 @@
           <w:sz w:val="28"/>
           <w:szCs w:val="28"/>
         </w:rPr>
-        <w:t xml:space="preserve">The deep learning model is built using TensorFlow and </w:t>
-      </w:r>
-      <w:proofErr w:type="spellStart"/>
-      <w:r>
-        <w:rPr>
-          <w:rFonts w:ascii="Times New Roman" w:hAnsi="Times New Roman" w:cs="Times New Roman"/>
-          <w:sz w:val="28"/>
-          <w:szCs w:val="28"/>
-        </w:rPr>
-        <w:t>Keras</w:t>
-      </w:r>
-      <w:proofErr w:type="spellEnd"/>
-      <w:r>
-        <w:rPr>
-          <w:rFonts w:ascii="Times New Roman" w:hAnsi="Times New Roman" w:cs="Times New Roman"/>
-          <w:sz w:val="28"/>
-          <w:szCs w:val="28"/>
-        </w:rPr>
-        <w:t>. A Sequential LSTM architecture is implemented with multiple LSTM layers, dropout layers for regularization, and dense layers for final prediction. The model uses binary cross-entropy loss and the Adam optimizer. The dataset is split into training and testing sets for evaluation. This model predicts machine failure probability based on sequential sensor inputs.</w:t>
+        <w:t>The deep learning model is built using TensorFlow and Keras. A Sequential LSTM architecture is implemented with multiple LSTM layers, dropout layers for regularization, and dense layers for final prediction. The model uses binary cross-entropy loss and the Adam optimizer. The dataset is split into training and testing sets for evaluation. This model predicts machine failure probability based on sequential sensor inputs.</w:t>
       </w:r>
     </w:p>
     <w:p>
@@ -14789,25 +14065,7 @@
           <w:sz w:val="32"/>
           <w:szCs w:val="32"/>
         </w:rPr>
-        <w:t xml:space="preserve">The integration of </w:t>
-      </w:r>
-      <w:proofErr w:type="spellStart"/>
-      <w:r>
-        <w:rPr>
-          <w:rFonts w:ascii="Times New Roman" w:hAnsi="Times New Roman" w:cs="Times New Roman"/>
-          <w:sz w:val="32"/>
-          <w:szCs w:val="32"/>
-        </w:rPr>
-        <w:t>Supabase</w:t>
-      </w:r>
-      <w:proofErr w:type="spellEnd"/>
-      <w:r>
-        <w:rPr>
-          <w:rFonts w:ascii="Times New Roman" w:hAnsi="Times New Roman" w:cs="Times New Roman"/>
-          <w:sz w:val="32"/>
-          <w:szCs w:val="32"/>
-        </w:rPr>
-        <w:t xml:space="preserve"> cloud infrastructure ensures secure data storage, authentication, and logging, while the Flask-based backend and interactive dashboard enhance usability and accessibility. The project also demonstrates strong alignment with business objectives such as reducing operational costs, improving equipment lifespan, and enhancing overall system reliability.</w:t>
+        <w:t>The integration of Supabase cloud infrastructure ensures secure data storage, authentication, and logging, while the Flask-based backend and interactive dashboard enhance usability and accessibility. The project also demonstrates strong alignment with business objectives such as reducing operational costs, improving equipment lifespan, and enhancing overall system reliability.</w:t>
       </w:r>
     </w:p>
     <w:p>
@@ -14944,7 +14202,7 @@
         </w:rPr>
         <w:t xml:space="preserve"> </w:t>
       </w:r>
-      <w:hyperlink r:id="rId23" w:history="1">
+      <w:hyperlink r:id="rId24" w:history="1">
         <w:r>
           <w:rPr>
             <w:rStyle w:val="Hyperlink"/>
@@ -14987,7 +14245,7 @@
         </w:rPr>
         <w:t xml:space="preserve">LSTM: </w:t>
       </w:r>
-      <w:hyperlink r:id="rId24" w:history="1">
+      <w:hyperlink r:id="rId25" w:history="1">
         <w:r>
           <w:rPr>
             <w:rStyle w:val="Hyperlink"/>
@@ -15022,25 +14280,15 @@
           <w:szCs w:val="32"/>
         </w:rPr>
       </w:pPr>
-      <w:proofErr w:type="spellStart"/>
-      <w:r>
-        <w:rPr>
-          <w:rFonts w:ascii="Times New Roman" w:hAnsi="Times New Roman" w:cs="Times New Roman"/>
-          <w:sz w:val="32"/>
-          <w:szCs w:val="32"/>
-        </w:rPr>
-        <w:t>Keras</w:t>
-      </w:r>
-      <w:proofErr w:type="spellEnd"/>
-      <w:r>
-        <w:rPr>
-          <w:rFonts w:ascii="Times New Roman" w:hAnsi="Times New Roman" w:cs="Times New Roman"/>
-          <w:sz w:val="32"/>
-          <w:szCs w:val="32"/>
-        </w:rPr>
-        <w:t xml:space="preserve">: </w:t>
-      </w:r>
-      <w:hyperlink r:id="rId25" w:history="1">
+      <w:r>
+        <w:rPr>
+          <w:rFonts w:ascii="Times New Roman" w:hAnsi="Times New Roman" w:cs="Times New Roman"/>
+          <w:sz w:val="32"/>
+          <w:szCs w:val="32"/>
+        </w:rPr>
+        <w:t xml:space="preserve">Keras: </w:t>
+      </w:r>
+      <w:hyperlink r:id="rId26" w:history="1">
         <w:r>
           <w:rPr>
             <w:rStyle w:val="Hyperlink"/>
@@ -15083,7 +14331,7 @@
         </w:rPr>
         <w:t xml:space="preserve">Flask: </w:t>
       </w:r>
-      <w:hyperlink r:id="rId26" w:history="1">
+      <w:hyperlink r:id="rId27" w:history="1">
         <w:r>
           <w:rPr>
             <w:rStyle w:val="Hyperlink"/>
@@ -15105,10 +14353,9 @@
       </w:pPr>
     </w:p>
     <w:sectPr>
-      <w:footerReference w:type="default" r:id="rId27"/>
       <w:pgSz w:w="12240" w:h="15840"/>
       <w:pgMar w:top="1440" w:right="1440" w:bottom="1440" w:left="1440" w:header="720" w:footer="720" w:gutter="0"/>
-      <w:pgNumType w:fmt="upperRoman" w:start="1"/>
+      <w:pgNumType w:start="1"/>
       <w:cols w:space="720"/>
       <w:docGrid w:linePitch="360"/>
     </w:sectPr>

</xml_diff>